<commit_message>
Drafted word transformer block
</commit_message>
<xml_diff>
--- a/project-overview/todo.docx
+++ b/project-overview/todo.docx
@@ -1,6 +1,6 @@
 
 <file path=word/document.xml><?xml version="1.0" encoding="utf-8"?>
-<w:document xmlns:wpc="http://schemas.microsoft.com/office/word/2010/wordprocessingCanvas" xmlns:cx="http://schemas.microsoft.com/office/drawing/2014/chartex" xmlns:cx1="http://schemas.microsoft.com/office/drawing/2015/9/8/chartex" xmlns:cx2="http://schemas.microsoft.com/office/drawing/2015/10/21/chartex" xmlns:cx3="http://schemas.microsoft.com/office/drawing/2016/5/9/chartex" xmlns:cx4="http://schemas.microsoft.com/office/drawing/2016/5/10/chartex" xmlns:cx5="http://schemas.microsoft.com/office/drawing/2016/5/11/chartex" xmlns:cx6="http://schemas.microsoft.com/office/drawing/2016/5/12/chartex" xmlns:cx7="http://schemas.microsoft.com/office/drawing/2016/5/13/chartex" xmlns:cx8="http://schemas.microsoft.com/office/drawing/2016/5/14/chartex" xmlns:mc="http://schemas.openxmlformats.org/markup-compatibility/2006" xmlns:aink="http://schemas.microsoft.com/office/drawing/2016/ink" xmlns:am3d="http://schemas.microsoft.com/office/drawing/2017/model3d" xmlns:o="urn:schemas-microsoft-com:office:office" xmlns:oel="http://schemas.microsoft.com/office/2019/extlst" xmlns:r="http://schemas.openxmlformats.org/officeDocument/2006/relationships" xmlns:m="http://schemas.openxmlformats.org/officeDocument/2006/math" xmlns:v="urn:schemas-microsoft-com:vml" xmlns:wp14="http://schemas.microsoft.com/office/word/2010/wordprocessingDrawing" xmlns:wp="http://schemas.openxmlformats.org/drawingml/2006/wordprocessingDrawing" xmlns:w10="urn:schemas-microsoft-com:office:word" xmlns:w="http://schemas.openxmlformats.org/wordprocessingml/2006/main" xmlns:w14="http://schemas.microsoft.com/office/word/2010/wordml" xmlns:w15="http://schemas.microsoft.com/office/word/2012/wordml" xmlns:w16cex="http://schemas.microsoft.com/office/word/2018/wordml/cex" xmlns:w16cid="http://schemas.microsoft.com/office/word/2016/wordml/cid" xmlns:w16="http://schemas.microsoft.com/office/word/2018/wordml" xmlns:w16du="http://schemas.microsoft.com/office/word/2023/wordml/word16du" xmlns:w16sdtdh="http://schemas.microsoft.com/office/word/2020/wordml/sdtdatahash" xmlns:w16sdtfl="http://schemas.microsoft.com/office/word/2024/wordml/sdtformatlock" xmlns:w16se="http://schemas.microsoft.com/office/word/2015/wordml/symex" xmlns:wpg="http://schemas.microsoft.com/office/word/2010/wordprocessingGroup" xmlns:wpi="http://schemas.microsoft.com/office/word/2010/wordprocessingInk" xmlns:wne="http://schemas.microsoft.com/office/word/2006/wordml" xmlns:wps="http://schemas.microsoft.com/office/word/2010/wordprocessingShape" mc:Ignorable="w14 w15 w16se w16cid w16 w16cex w16sdtdh w16sdtfl w16du wp14">
+<w:document xmlns:wpc="http://schemas.microsoft.com/office/word/2010/wordprocessingCanvas" xmlns:cx="http://schemas.microsoft.com/office/drawing/2014/chartex" xmlns:cx1="http://schemas.microsoft.com/office/drawing/2015/9/8/chartex" xmlns:cx2="http://schemas.microsoft.com/office/drawing/2015/10/21/chartex" xmlns:cx3="http://schemas.microsoft.com/office/drawing/2016/5/9/chartex" xmlns:cx4="http://schemas.microsoft.com/office/drawing/2016/5/10/chartex" xmlns:cx5="http://schemas.microsoft.com/office/drawing/2016/5/11/chartex" xmlns:cx6="http://schemas.microsoft.com/office/drawing/2016/5/12/chartex" xmlns:cx7="http://schemas.microsoft.com/office/drawing/2016/5/13/chartex" xmlns:cx8="http://schemas.microsoft.com/office/drawing/2016/5/14/chartex" xmlns:mc="http://schemas.openxmlformats.org/markup-compatibility/2006" xmlns:aink="http://schemas.microsoft.com/office/drawing/2016/ink" xmlns:am3d="http://schemas.microsoft.com/office/drawing/2017/model3d" xmlns:o="urn:schemas-microsoft-com:office:office" xmlns:oel="http://schemas.microsoft.com/office/2019/extlst" xmlns:r="http://schemas.openxmlformats.org/officeDocument/2006/relationships" xmlns:m="http://schemas.openxmlformats.org/officeDocument/2006/math" xmlns:v="urn:schemas-microsoft-com:vml" xmlns:wp14="http://schemas.microsoft.com/office/word/2010/wordprocessingDrawing" xmlns:wp="http://schemas.openxmlformats.org/drawingml/2006/wordprocessingDrawing" xmlns:w10="urn:schemas-microsoft-com:office:word" xmlns:w="http://schemas.openxmlformats.org/wordprocessingml/2006/main" xmlns:w14="http://schemas.microsoft.com/office/word/2010/wordml" xmlns:w15="http://schemas.microsoft.com/office/word/2012/wordml" xmlns:w16cex="http://schemas.microsoft.com/office/word/2018/wordml/cex" xmlns:w16cid="http://schemas.microsoft.com/office/word/2016/wordml/cid" xmlns:w16="http://schemas.microsoft.com/office/word/2018/wordml" xmlns:w16sdtdh="http://schemas.microsoft.com/office/word/2020/wordml/sdtdatahash" xmlns:w16se="http://schemas.microsoft.com/office/word/2015/wordml/symex" xmlns:wpg="http://schemas.microsoft.com/office/word/2010/wordprocessingGroup" xmlns:wpi="http://schemas.microsoft.com/office/word/2010/wordprocessingInk" xmlns:wne="http://schemas.microsoft.com/office/word/2006/wordml" xmlns:wps="http://schemas.microsoft.com/office/word/2010/wordprocessingShape" mc:Ignorable="w14 w15 w16se w16cid w16 w16cex w16sdtdh wp14">
   <w:body>
     <w:p>
       <w:pPr>
@@ -127,6 +127,92 @@
           <w:szCs w:val="22"/>
         </w:rPr>
         <w:t xml:space="preserve"> </w:t>
+      </w:r>
+      <w:r>
+        <w:rPr>
+          <w:rFonts w:ascii="Andale Mono" w:hAnsi="Andale Mono" w:cs="Andale Mono"/>
+          <w:color w:val="000000" w:themeColor="text1"/>
+          <w:kern w:val="0"/>
+          <w:sz w:val="22"/>
+          <w:szCs w:val="22"/>
+        </w:rPr>
+        <w:sym w:font="Wingdings" w:char="F0E0"/>
+      </w:r>
+      <w:r>
+        <w:rPr>
+          <w:rFonts w:ascii="Andale Mono" w:hAnsi="Andale Mono" w:cs="Andale Mono"/>
+          <w:color w:val="000000" w:themeColor="text1"/>
+          <w:kern w:val="0"/>
+          <w:sz w:val="22"/>
+          <w:szCs w:val="22"/>
+        </w:rPr>
+        <w:t xml:space="preserve"> some things to always remember: homebrew is required to install the </w:t>
+      </w:r>
+      <w:proofErr w:type="spellStart"/>
+      <w:r>
+        <w:rPr>
+          <w:rFonts w:ascii="Andale Mono" w:hAnsi="Andale Mono" w:cs="Andale Mono"/>
+          <w:color w:val="000000" w:themeColor="text1"/>
+          <w:kern w:val="0"/>
+          <w:sz w:val="22"/>
+          <w:szCs w:val="22"/>
+        </w:rPr>
+        <w:t>espeak</w:t>
+      </w:r>
+      <w:proofErr w:type="spellEnd"/>
+      <w:r>
+        <w:rPr>
+          <w:rFonts w:ascii="Andale Mono" w:hAnsi="Andale Mono" w:cs="Andale Mono"/>
+          <w:color w:val="000000" w:themeColor="text1"/>
+          <w:kern w:val="0"/>
+          <w:sz w:val="22"/>
+          <w:szCs w:val="22"/>
+        </w:rPr>
+        <w:t xml:space="preserve"> backend for </w:t>
+      </w:r>
+      <w:proofErr w:type="spellStart"/>
+      <w:r>
+        <w:rPr>
+          <w:rFonts w:ascii="Andale Mono" w:hAnsi="Andale Mono" w:cs="Andale Mono"/>
+          <w:color w:val="000000" w:themeColor="text1"/>
+          <w:kern w:val="0"/>
+          <w:sz w:val="22"/>
+          <w:szCs w:val="22"/>
+        </w:rPr>
+        <w:t>phonemizer</w:t>
+      </w:r>
+      <w:proofErr w:type="spellEnd"/>
+      <w:r>
+        <w:rPr>
+          <w:rFonts w:ascii="Andale Mono" w:hAnsi="Andale Mono" w:cs="Andale Mono"/>
+          <w:color w:val="000000" w:themeColor="text1"/>
+          <w:kern w:val="0"/>
+          <w:sz w:val="22"/>
+          <w:szCs w:val="22"/>
+        </w:rPr>
+        <w:t xml:space="preserve">, and it needs to (a) be the correct architecture (ARM64 for M1-M5 mac chips) and (b) needs to be able to interact with </w:t>
+      </w:r>
+      <w:proofErr w:type="spellStart"/>
+      <w:r>
+        <w:rPr>
+          <w:rFonts w:ascii="Andale Mono" w:hAnsi="Andale Mono" w:cs="Andale Mono"/>
+          <w:color w:val="000000" w:themeColor="text1"/>
+          <w:kern w:val="0"/>
+          <w:sz w:val="22"/>
+          <w:szCs w:val="22"/>
+        </w:rPr>
+        <w:t>conda</w:t>
+      </w:r>
+      <w:proofErr w:type="spellEnd"/>
+      <w:r>
+        <w:rPr>
+          <w:rFonts w:ascii="Andale Mono" w:hAnsi="Andale Mono" w:cs="Andale Mono"/>
+          <w:color w:val="000000" w:themeColor="text1"/>
+          <w:kern w:val="0"/>
+          <w:sz w:val="22"/>
+          <w:szCs w:val="22"/>
+        </w:rPr>
+        <w:t>, so finagling with the path will be necessary!</w:t>
       </w:r>
     </w:p>
     <w:p>
@@ -358,6 +444,7 @@
         <w:t>text,language</w:t>
       </w:r>
       <w:proofErr w:type="spellEnd"/>
+      <w:proofErr w:type="gramEnd"/>
       <w:r>
         <w:rPr>
           <w:rFonts w:ascii="Andale Mono" w:hAnsi="Andale Mono"/>
@@ -374,7 +461,6 @@
         <w:t>en</w:t>
       </w:r>
       <w:proofErr w:type="spellEnd"/>
-      <w:proofErr w:type="gramEnd"/>
       <w:r>
         <w:rPr>
           <w:rFonts w:ascii="Andale Mono" w:hAnsi="Andale Mono"/>
@@ -388,15 +474,7 @@
           <w:rFonts w:ascii="Andale Mono" w:hAnsi="Andale Mono"/>
           <w:color w:val="000000" w:themeColor="text1"/>
         </w:rPr>
-        <w:t>us</w:t>
-      </w:r>
-      <w:proofErr w:type="gramStart"/>
-      <w:r>
-        <w:rPr>
-          <w:rFonts w:ascii="Andale Mono" w:hAnsi="Andale Mono"/>
-          <w:color w:val="000000" w:themeColor="text1"/>
-        </w:rPr>
-        <w:t>”,backend</w:t>
+        <w:t>us”,backend</w:t>
       </w:r>
       <w:proofErr w:type="spellEnd"/>
       <w:r>
@@ -415,13 +493,42 @@
         <w:t>espeak</w:t>
       </w:r>
       <w:proofErr w:type="spellEnd"/>
-      <w:proofErr w:type="gramEnd"/>
       <w:r>
         <w:rPr>
           <w:rFonts w:ascii="Andale Mono" w:hAnsi="Andale Mono"/>
           <w:color w:val="000000" w:themeColor="text1"/>
         </w:rPr>
         <w:t xml:space="preserve">”) yields the latter? </w:t>
+      </w:r>
+    </w:p>
+    <w:p>
+      <w:pPr>
+        <w:pStyle w:val="ListParagraph"/>
+        <w:ind w:left="2160"/>
+        <w:rPr>
+          <w:rFonts w:ascii="Andale Mono" w:hAnsi="Andale Mono"/>
+          <w:color w:val="000000" w:themeColor="text1"/>
+        </w:rPr>
+      </w:pPr>
+    </w:p>
+    <w:p>
+      <w:pPr>
+        <w:rPr>
+          <w:rFonts w:ascii="Andale Mono" w:hAnsi="Andale Mono"/>
+        </w:rPr>
+      </w:pPr>
+    </w:p>
+    <w:p>
+      <w:pPr>
+        <w:rPr>
+          <w:rFonts w:ascii="Andale Mono" w:hAnsi="Andale Mono"/>
+        </w:rPr>
+      </w:pPr>
+      <w:r>
+        <w:rPr>
+          <w:rFonts w:ascii="Andale Mono" w:hAnsi="Andale Mono"/>
+        </w:rPr>
+        <w:t xml:space="preserve">PENDING: </w:t>
       </w:r>
     </w:p>
     <w:p>
@@ -438,36 +545,230 @@
       </w:pPr>
       <w:r>
         <w:rPr>
-          <w:rFonts w:ascii="Andale Mono" w:hAnsi="Andale Mono"/>
-          <w:color w:val="000000" w:themeColor="text1"/>
-        </w:rPr>
-        <w:t xml:space="preserve">TODO: figure out where and when the transcription and data prep pipeline converges on UNK tokens for words that shouldn’t throw problems, like `hierarchy`, </w:t>
-      </w:r>
-      <w:proofErr w:type="gramStart"/>
-      <w:r>
-        <w:rPr>
-          <w:rFonts w:ascii="Andale Mono" w:hAnsi="Andale Mono"/>
-          <w:color w:val="000000" w:themeColor="text1"/>
-        </w:rPr>
-        <w:t>and also</w:t>
-      </w:r>
-      <w:proofErr w:type="gramEnd"/>
-      <w:r>
-        <w:rPr>
-          <w:rFonts w:ascii="Andale Mono" w:hAnsi="Andale Mono"/>
-          <w:color w:val="000000" w:themeColor="text1"/>
-        </w:rPr>
-        <w:t xml:space="preserve"> periods, </w:t>
-      </w:r>
-      <w:proofErr w:type="spellStart"/>
-      <w:r>
-        <w:rPr>
-          <w:rFonts w:ascii="Andale Mono" w:hAnsi="Andale Mono"/>
-          <w:color w:val="000000" w:themeColor="text1"/>
-        </w:rPr>
-        <w:t>etc</w:t>
-      </w:r>
-      <w:proofErr w:type="spellEnd"/>
+          <w:rFonts w:ascii="Andale Mono" w:hAnsi="Andale Mono" w:cs="Andale Mono"/>
+          <w:color w:val="000000" w:themeColor="text1"/>
+          <w:kern w:val="0"/>
+          <w:sz w:val="22"/>
+          <w:szCs w:val="22"/>
+        </w:rPr>
+        <w:t>(03/27) DRAFTING the model.py file</w:t>
+      </w:r>
+    </w:p>
+    <w:p>
+      <w:pPr>
+        <w:pStyle w:val="ListParagraph"/>
+        <w:rPr>
+          <w:rFonts w:ascii="Andale Mono" w:hAnsi="Andale Mono"/>
+          <w:color w:val="000000" w:themeColor="text1"/>
+        </w:rPr>
+      </w:pPr>
+    </w:p>
+    <w:p>
+      <w:pPr>
+        <w:pStyle w:val="ListParagraph"/>
+        <w:rPr>
+          <w:b/>
+          <w:bCs/>
+        </w:rPr>
+      </w:pPr>
+    </w:p>
+    <w:p>
+      <w:pPr>
+        <w:rPr>
+          <w:rFonts w:ascii="Andale Mono" w:hAnsi="Andale Mono"/>
+        </w:rPr>
+      </w:pPr>
+      <w:r>
+        <w:rPr>
+          <w:rFonts w:ascii="Andale Mono" w:hAnsi="Andale Mono"/>
+        </w:rPr>
+        <w:t>DONE:</w:t>
+      </w:r>
+    </w:p>
+    <w:p>
+      <w:pPr>
+        <w:pStyle w:val="ListParagraph"/>
+        <w:numPr>
+          <w:ilvl w:val="0"/>
+          <w:numId w:val="2"/>
+        </w:numPr>
+        <w:rPr>
+          <w:rFonts w:ascii="Andale Mono" w:hAnsi="Andale Mono"/>
+        </w:rPr>
+      </w:pPr>
+      <w:r>
+        <w:rPr>
+          <w:rFonts w:ascii="Andale Mono" w:hAnsi="Andale Mono"/>
+          <w:b/>
+          <w:bCs/>
+        </w:rPr>
+        <w:t>DRAFTED (04/07)</w:t>
+      </w:r>
+      <w:r>
+        <w:rPr>
+          <w:rFonts w:ascii="Andale Mono" w:hAnsi="Andale Mono"/>
+        </w:rPr>
+        <w:t xml:space="preserve"> the boundary-aware </w:t>
+      </w:r>
+      <w:proofErr w:type="spellStart"/>
+      <w:r>
+        <w:rPr>
+          <w:rFonts w:ascii="Andale Mono" w:hAnsi="Andale Mono"/>
+        </w:rPr>
+        <w:t>downsampling</w:t>
+      </w:r>
+      <w:proofErr w:type="spellEnd"/>
+      <w:r>
+        <w:rPr>
+          <w:rFonts w:ascii="Andale Mono" w:hAnsi="Andale Mono"/>
+        </w:rPr>
+        <w:t xml:space="preserve"> convolution block, such that only phonemes get mean-pooled, while avoiding pooling any spaces or other punctuation marks or special </w:t>
+      </w:r>
+      <w:proofErr w:type="spellStart"/>
+      <w:r>
+        <w:rPr>
+          <w:rFonts w:ascii="Andale Mono" w:hAnsi="Andale Mono"/>
+        </w:rPr>
+        <w:t>sos</w:t>
+      </w:r>
+      <w:proofErr w:type="spellEnd"/>
+      <w:r>
+        <w:rPr>
+          <w:rFonts w:ascii="Andale Mono" w:hAnsi="Andale Mono"/>
+        </w:rPr>
+        <w:t xml:space="preserve"> and </w:t>
+      </w:r>
+      <w:proofErr w:type="spellStart"/>
+      <w:r>
+        <w:rPr>
+          <w:rFonts w:ascii="Andale Mono" w:hAnsi="Andale Mono"/>
+        </w:rPr>
+        <w:t>eos</w:t>
+      </w:r>
+      <w:proofErr w:type="spellEnd"/>
+      <w:r>
+        <w:rPr>
+          <w:rFonts w:ascii="Andale Mono" w:hAnsi="Andale Mono"/>
+        </w:rPr>
+        <w:t xml:space="preserve"> tokens</w:t>
+      </w:r>
+    </w:p>
+    <w:p>
+      <w:pPr>
+        <w:pStyle w:val="ListParagraph"/>
+        <w:numPr>
+          <w:ilvl w:val="0"/>
+          <w:numId w:val="3"/>
+        </w:numPr>
+        <w:rPr>
+          <w:rFonts w:ascii="Andale Mono" w:hAnsi="Andale Mono"/>
+          <w:color w:val="000000" w:themeColor="text1"/>
+        </w:rPr>
+      </w:pPr>
+      <w:r>
+        <w:rPr>
+          <w:rFonts w:ascii="Andale Mono" w:hAnsi="Andale Mono"/>
+          <w:b/>
+          <w:bCs/>
+        </w:rPr>
+        <w:t xml:space="preserve">FIXED (04/03) </w:t>
+      </w:r>
+      <w:r>
+        <w:rPr>
+          <w:rFonts w:ascii="Andale Mono" w:hAnsi="Andale Mono"/>
+        </w:rPr>
+        <w:t xml:space="preserve">the transcribe_dataset.py issues with UNK tokens—the problem was in the argument that set everything to lowercase, including the special tags, such that the </w:t>
+      </w:r>
+      <w:proofErr w:type="spellStart"/>
+      <w:r>
+        <w:rPr>
+          <w:rFonts w:ascii="Andale Mono" w:hAnsi="Andale Mono"/>
+        </w:rPr>
+        <w:t>phoneme_to_id</w:t>
+      </w:r>
+      <w:proofErr w:type="spellEnd"/>
+      <w:r>
+        <w:rPr>
+          <w:rFonts w:ascii="Andale Mono" w:hAnsi="Andale Mono"/>
+        </w:rPr>
+        <w:t xml:space="preserve"> vocab couldn’t identify the tags!!! </w:t>
+      </w:r>
+      <w:r>
+        <w:rPr>
+          <w:rFonts w:ascii="Andale Mono" w:hAnsi="Andale Mono"/>
+        </w:rPr>
+        <w:sym w:font="Wingdings" w:char="F0E0"/>
+      </w:r>
+      <w:r>
+        <w:rPr>
+          <w:rFonts w:ascii="Andale Mono" w:hAnsi="Andale Mono"/>
+        </w:rPr>
+        <w:t xml:space="preserve"> responds to the following originally pending item: </w:t>
+      </w:r>
+      <w:r>
+        <w:rPr>
+          <w:rFonts w:ascii="Andale Mono" w:hAnsi="Andale Mono"/>
+          <w:color w:val="000000" w:themeColor="text1"/>
+        </w:rPr>
+        <w:t>(03/24) DRAFTING the data.py file, and when working on the &lt;PAD&gt;</w:t>
+      </w:r>
+      <w:proofErr w:type="spellStart"/>
+      <w:r>
+        <w:rPr>
+          <w:rFonts w:ascii="Andale Mono" w:hAnsi="Andale Mono"/>
+          <w:color w:val="000000" w:themeColor="text1"/>
+        </w:rPr>
+        <w:t>dding</w:t>
+      </w:r>
+      <w:proofErr w:type="spellEnd"/>
+      <w:r>
+        <w:rPr>
+          <w:rFonts w:ascii="Andale Mono" w:hAnsi="Andale Mono"/>
+          <w:color w:val="000000" w:themeColor="text1"/>
+        </w:rPr>
+        <w:t xml:space="preserve"> to get the sequence lengths to match within a batch, I realized that the transcription is classing some whole words as &lt;UNK&gt;, such as “hierarchy” in the following </w:t>
+      </w:r>
+      <w:proofErr w:type="spellStart"/>
+      <w:r>
+        <w:rPr>
+          <w:rFonts w:ascii="Andale Mono" w:hAnsi="Andale Mono"/>
+          <w:color w:val="000000" w:themeColor="text1"/>
+        </w:rPr>
+        <w:t>json</w:t>
+      </w:r>
+      <w:proofErr w:type="spellEnd"/>
+      <w:r>
+        <w:rPr>
+          <w:rFonts w:ascii="Andale Mono" w:hAnsi="Andale Mono"/>
+          <w:color w:val="000000" w:themeColor="text1"/>
+        </w:rPr>
+        <w:t xml:space="preserve"> line, and </w:t>
+      </w:r>
+      <w:r>
+        <w:rPr>
+          <w:rFonts w:ascii="Andale Mono" w:hAnsi="Andale Mono"/>
+          <w:b/>
+          <w:bCs/>
+          <w:color w:val="000000" w:themeColor="text1"/>
+        </w:rPr>
+        <w:t>this should be fixed</w:t>
+      </w:r>
+      <w:r>
+        <w:rPr>
+          <w:rFonts w:ascii="Andale Mono" w:hAnsi="Andale Mono"/>
+          <w:color w:val="000000" w:themeColor="text1"/>
+        </w:rPr>
+        <w:t xml:space="preserve"> to make the most of the dataset and next-token prediction algorithm: </w:t>
+      </w:r>
+    </w:p>
+    <w:p>
+      <w:pPr>
+        <w:pStyle w:val="ListParagraph"/>
+        <w:rPr>
+          <w:rFonts w:ascii="Andale Mono" w:hAnsi="Andale Mono"/>
+          <w:color w:val="000000" w:themeColor="text1"/>
+        </w:rPr>
+      </w:pPr>
     </w:p>
     <w:p>
       <w:pPr>
@@ -478,309 +779,6 @@
         </w:numPr>
         <w:rPr>
           <w:rFonts w:ascii="Andale Mono" w:hAnsi="Andale Mono"/>
-          <w:color w:val="000000" w:themeColor="text1"/>
-        </w:rPr>
-      </w:pPr>
-      <w:r>
-        <w:rPr>
-          <w:rFonts w:ascii="Andale Mono" w:hAnsi="Andale Mono"/>
-          <w:color w:val="000000" w:themeColor="text1"/>
-        </w:rPr>
-        <w:t xml:space="preserve">A good starting place to debug might be in transcribe_dataset.py: see line 36 where I comment: </w:t>
-      </w:r>
-    </w:p>
-    <w:p>
-      <w:pPr>
-        <w:pStyle w:val="ListParagraph"/>
-        <w:numPr>
-          <w:ilvl w:val="2"/>
-          <w:numId w:val="3"/>
-        </w:numPr>
-        <w:rPr>
-          <w:rFonts w:ascii="Andale Mono" w:hAnsi="Andale Mono"/>
-          <w:color w:val="000000" w:themeColor="text1"/>
-        </w:rPr>
-      </w:pPr>
-      <w:r>
-        <w:rPr>
-          <w:rFonts w:ascii="Andale Mono" w:hAnsi="Andale Mono"/>
-          <w:color w:val="000000" w:themeColor="text1"/>
-        </w:rPr>
-        <w:t xml:space="preserve"># Try to catch </w:t>
-      </w:r>
-      <w:proofErr w:type="spellStart"/>
-      <w:r>
-        <w:rPr>
-          <w:rFonts w:ascii="Andale Mono" w:hAnsi="Andale Mono"/>
-          <w:color w:val="000000" w:themeColor="text1"/>
-        </w:rPr>
-        <w:t>utf</w:t>
-      </w:r>
-      <w:proofErr w:type="spellEnd"/>
-      <w:r>
-        <w:rPr>
-          <w:rFonts w:ascii="Andale Mono" w:hAnsi="Andale Mono"/>
-          <w:color w:val="000000" w:themeColor="text1"/>
-        </w:rPr>
-        <w:t xml:space="preserve"> encoding errors resulting from mis-formatted strings early</w:t>
-      </w:r>
-    </w:p>
-    <w:p>
-      <w:pPr>
-        <w:pStyle w:val="ListParagraph"/>
-        <w:numPr>
-          <w:ilvl w:val="2"/>
-          <w:numId w:val="3"/>
-        </w:numPr>
-        <w:rPr>
-          <w:rFonts w:ascii="Andale Mono" w:hAnsi="Andale Mono"/>
-          <w:color w:val="000000" w:themeColor="text1"/>
-        </w:rPr>
-      </w:pPr>
-      <w:r>
-        <w:rPr>
-          <w:rFonts w:ascii="Andale Mono" w:hAnsi="Andale Mono"/>
-          <w:color w:val="000000" w:themeColor="text1"/>
-        </w:rPr>
-        <w:t xml:space="preserve">E.g. why are these </w:t>
-      </w:r>
-      <w:proofErr w:type="spellStart"/>
-      <w:r>
-        <w:rPr>
-          <w:rFonts w:ascii="Andale Mono" w:hAnsi="Andale Mono"/>
-          <w:color w:val="000000" w:themeColor="text1"/>
-        </w:rPr>
-        <w:t>utf</w:t>
-      </w:r>
-      <w:proofErr w:type="spellEnd"/>
-      <w:r>
-        <w:rPr>
-          <w:rFonts w:ascii="Andale Mono" w:hAnsi="Andale Mono"/>
-          <w:color w:val="000000" w:themeColor="text1"/>
-        </w:rPr>
-        <w:t xml:space="preserve"> encoding errors popping up? </w:t>
-      </w:r>
-      <w:proofErr w:type="gramStart"/>
-      <w:r>
-        <w:rPr>
-          <w:rFonts w:ascii="Andale Mono" w:hAnsi="Andale Mono"/>
-          <w:color w:val="000000" w:themeColor="text1"/>
-        </w:rPr>
-        <w:t>Take a look</w:t>
-      </w:r>
-      <w:proofErr w:type="gramEnd"/>
-      <w:r>
-        <w:rPr>
-          <w:rFonts w:ascii="Andale Mono" w:hAnsi="Andale Mono"/>
-          <w:color w:val="000000" w:themeColor="text1"/>
-        </w:rPr>
-        <w:t xml:space="preserve"> at the Wikipedia strings to see if you can spot them by eye?</w:t>
-      </w:r>
-    </w:p>
-    <w:p>
-      <w:pPr>
-        <w:pStyle w:val="ListParagraph"/>
-        <w:numPr>
-          <w:ilvl w:val="2"/>
-          <w:numId w:val="3"/>
-        </w:numPr>
-        <w:rPr>
-          <w:rFonts w:ascii="Andale Mono" w:hAnsi="Andale Mono"/>
-          <w:color w:val="000000" w:themeColor="text1"/>
-        </w:rPr>
-      </w:pPr>
-      <w:proofErr w:type="gramStart"/>
-      <w:r>
-        <w:rPr>
-          <w:rFonts w:ascii="Andale Mono" w:hAnsi="Andale Mono"/>
-          <w:color w:val="000000" w:themeColor="text1"/>
-        </w:rPr>
-        <w:t>OOOOHHHH</w:t>
-      </w:r>
-      <w:proofErr w:type="gramEnd"/>
-      <w:r>
-        <w:rPr>
-          <w:rFonts w:ascii="Andale Mono" w:hAnsi="Andale Mono"/>
-          <w:color w:val="000000" w:themeColor="text1"/>
-        </w:rPr>
-        <w:t xml:space="preserve"> you know, I wonder if the normalization operation is preventing the transcribe_dataset.py from recognizing the inputs as utf-8 encoded???? </w:t>
-      </w:r>
-      <w:r>
-        <w:rPr>
-          <w:rFonts w:ascii="Andale Mono" w:hAnsi="Andale Mono"/>
-          <w:color w:val="000000" w:themeColor="text1"/>
-        </w:rPr>
-        <w:t>E.g. `</w:t>
-      </w:r>
-      <w:proofErr w:type="spellStart"/>
-      <w:r>
-        <w:rPr>
-          <w:rFonts w:ascii="Andale Mono" w:hAnsi="Andale Mono"/>
-          <w:color w:val="000000" w:themeColor="text1"/>
-        </w:rPr>
-        <w:t>clean_wikipedia_text</w:t>
-      </w:r>
-      <w:proofErr w:type="spellEnd"/>
-      <w:r>
-        <w:rPr>
-          <w:rFonts w:ascii="Andale Mono" w:hAnsi="Andale Mono"/>
-          <w:color w:val="000000" w:themeColor="text1"/>
-        </w:rPr>
-        <w:t xml:space="preserve">` is getting called AFTER the encoding normalization, but maybe I should do it BEFORE? </w:t>
-      </w:r>
-    </w:p>
-    <w:p>
-      <w:pPr>
-        <w:rPr>
-          <w:rFonts w:ascii="Andale Mono" w:hAnsi="Andale Mono"/>
-        </w:rPr>
-      </w:pPr>
-    </w:p>
-    <w:p>
-      <w:pPr>
-        <w:rPr>
-          <w:rFonts w:ascii="Andale Mono" w:hAnsi="Andale Mono"/>
-        </w:rPr>
-      </w:pPr>
-      <w:r>
-        <w:rPr>
-          <w:rFonts w:ascii="Andale Mono" w:hAnsi="Andale Mono"/>
-        </w:rPr>
-        <w:t xml:space="preserve">PENDING: </w:t>
-      </w:r>
-    </w:p>
-    <w:p>
-      <w:pPr>
-        <w:pStyle w:val="ListParagraph"/>
-        <w:numPr>
-          <w:ilvl w:val="0"/>
-          <w:numId w:val="3"/>
-        </w:numPr>
-        <w:rPr>
-          <w:rFonts w:ascii="Andale Mono" w:hAnsi="Andale Mono"/>
-          <w:color w:val="000000" w:themeColor="text1"/>
-        </w:rPr>
-      </w:pPr>
-      <w:r>
-        <w:rPr>
-          <w:rFonts w:ascii="Andale Mono" w:hAnsi="Andale Mono" w:cs="Andale Mono"/>
-          <w:color w:val="000000" w:themeColor="text1"/>
-          <w:kern w:val="0"/>
-          <w:sz w:val="22"/>
-          <w:szCs w:val="22"/>
-        </w:rPr>
-        <w:t>Figure out how to use the train_corpus_ipa.txt file to train a little Pythia-like model</w:t>
-      </w:r>
-    </w:p>
-    <w:p>
-      <w:pPr>
-        <w:pStyle w:val="ListParagraph"/>
-        <w:numPr>
-          <w:ilvl w:val="0"/>
-          <w:numId w:val="3"/>
-        </w:numPr>
-        <w:rPr>
-          <w:rFonts w:ascii="Andale Mono" w:hAnsi="Andale Mono"/>
-          <w:color w:val="000000" w:themeColor="text1"/>
-        </w:rPr>
-      </w:pPr>
-      <w:r>
-        <w:rPr>
-          <w:rFonts w:ascii="Andale Mono" w:hAnsi="Andale Mono" w:cs="Andale Mono"/>
-          <w:color w:val="000000" w:themeColor="text1"/>
-          <w:kern w:val="0"/>
-          <w:sz w:val="22"/>
-          <w:szCs w:val="22"/>
-        </w:rPr>
-        <w:t>(03/27) DRAFTING the model.py file</w:t>
-      </w:r>
-    </w:p>
-    <w:p>
-      <w:pPr>
-        <w:pStyle w:val="ListParagraph"/>
-        <w:numPr>
-          <w:ilvl w:val="0"/>
-          <w:numId w:val="3"/>
-        </w:numPr>
-        <w:rPr>
-          <w:rFonts w:ascii="Andale Mono" w:hAnsi="Andale Mono"/>
-          <w:color w:val="000000" w:themeColor="text1"/>
-        </w:rPr>
-      </w:pPr>
-      <w:r>
-        <w:rPr>
-          <w:rFonts w:ascii="Andale Mono" w:hAnsi="Andale Mono"/>
-          <w:color w:val="000000" w:themeColor="text1"/>
-        </w:rPr>
-        <w:t>(03/24) DRAFTING the data.py file, and when working on the &lt;PAD&gt;</w:t>
-      </w:r>
-      <w:proofErr w:type="spellStart"/>
-      <w:r>
-        <w:rPr>
-          <w:rFonts w:ascii="Andale Mono" w:hAnsi="Andale Mono"/>
-          <w:color w:val="000000" w:themeColor="text1"/>
-        </w:rPr>
-        <w:t>dding</w:t>
-      </w:r>
-      <w:proofErr w:type="spellEnd"/>
-      <w:r>
-        <w:rPr>
-          <w:rFonts w:ascii="Andale Mono" w:hAnsi="Andale Mono"/>
-          <w:color w:val="000000" w:themeColor="text1"/>
-        </w:rPr>
-        <w:t xml:space="preserve"> to get the sequence lengths to match within a batch, I realized that the transcription is classing some whole words as &lt;UNK&gt;, such as “hierarchy” in the following </w:t>
-      </w:r>
-      <w:proofErr w:type="spellStart"/>
-      <w:r>
-        <w:rPr>
-          <w:rFonts w:ascii="Andale Mono" w:hAnsi="Andale Mono"/>
-          <w:color w:val="000000" w:themeColor="text1"/>
-        </w:rPr>
-        <w:t>json</w:t>
-      </w:r>
-      <w:proofErr w:type="spellEnd"/>
-      <w:r>
-        <w:rPr>
-          <w:rFonts w:ascii="Andale Mono" w:hAnsi="Andale Mono"/>
-          <w:color w:val="000000" w:themeColor="text1"/>
-        </w:rPr>
-        <w:t xml:space="preserve"> line, and </w:t>
-      </w:r>
-      <w:r>
-        <w:rPr>
-          <w:rFonts w:ascii="Andale Mono" w:hAnsi="Andale Mono"/>
-          <w:b/>
-          <w:bCs/>
-          <w:color w:val="000000" w:themeColor="text1"/>
-        </w:rPr>
-        <w:t>this should be fixed</w:t>
-      </w:r>
-      <w:r>
-        <w:rPr>
-          <w:rFonts w:ascii="Andale Mono" w:hAnsi="Andale Mono"/>
-          <w:color w:val="000000" w:themeColor="text1"/>
-        </w:rPr>
-        <w:t xml:space="preserve"> to make the most of the dataset and next-token prediction algorithm: </w:t>
-      </w:r>
-    </w:p>
-    <w:p>
-      <w:pPr>
-        <w:pStyle w:val="ListParagraph"/>
-        <w:rPr>
-          <w:rFonts w:ascii="Andale Mono" w:hAnsi="Andale Mono"/>
-          <w:color w:val="000000" w:themeColor="text1"/>
-        </w:rPr>
-      </w:pPr>
-    </w:p>
-    <w:p>
-      <w:pPr>
-        <w:pStyle w:val="ListParagraph"/>
-        <w:numPr>
-          <w:ilvl w:val="1"/>
-          <w:numId w:val="3"/>
-        </w:numPr>
-        <w:rPr>
-          <w:rFonts w:ascii="Andale Mono" w:hAnsi="Andale Mono"/>
           <w:color w:val="BF4E14" w:themeColor="accent2" w:themeShade="BF"/>
         </w:rPr>
       </w:pPr>
@@ -811,47 +809,6 @@
           <w:color w:val="BF4E14" w:themeColor="accent2" w:themeShade="BF"/>
         </w:rPr>
         <w:t xml:space="preserve"> </w:t>
-      </w:r>
-    </w:p>
-    <w:p>
-      <w:pPr>
-        <w:pStyle w:val="ListParagraph"/>
-        <w:ind w:left="1440"/>
-        <w:rPr>
-          <w:rFonts w:ascii="Andale Mono" w:hAnsi="Andale Mono"/>
-          <w:color w:val="000000" w:themeColor="text1"/>
-        </w:rPr>
-      </w:pPr>
-    </w:p>
-    <w:p>
-      <w:pPr>
-        <w:pStyle w:val="ListParagraph"/>
-        <w:rPr>
-          <w:rFonts w:ascii="Andale Mono" w:hAnsi="Andale Mono"/>
-          <w:color w:val="000000" w:themeColor="text1"/>
-        </w:rPr>
-      </w:pPr>
-    </w:p>
-    <w:p>
-      <w:pPr>
-        <w:pStyle w:val="ListParagraph"/>
-        <w:rPr>
-          <w:b/>
-          <w:bCs/>
-        </w:rPr>
-      </w:pPr>
-    </w:p>
-    <w:p>
-      <w:pPr>
-        <w:rPr>
-          <w:rFonts w:ascii="Andale Mono" w:hAnsi="Andale Mono"/>
-        </w:rPr>
-      </w:pPr>
-      <w:r>
-        <w:rPr>
-          <w:rFonts w:ascii="Andale Mono" w:hAnsi="Andale Mono"/>
-        </w:rPr>
-        <w:t>DONE:</w:t>
       </w:r>
     </w:p>
     <w:p>
@@ -1524,7 +1481,7 @@
           <w:szCs w:val="22"/>
           <w14:ligatures w14:val="none"/>
         </w:rPr>
-        <w:t xml:space="preserve"> install -c </w:t>
+        <w:t xml:space="preserve"> install </w:t>
       </w:r>
       <w:proofErr w:type="spellStart"/>
       <w:r>
@@ -1536,7 +1493,7 @@
           <w:szCs w:val="22"/>
           <w14:ligatures w14:val="none"/>
         </w:rPr>
-        <w:t>conda</w:t>
+        <w:t>-c conda</w:t>
       </w:r>
       <w:proofErr w:type="spellEnd"/>
       <w:r>
@@ -1793,7 +1750,7 @@
 </file>
 
 <file path=word/comments.xml><?xml version="1.0" encoding="utf-8"?>
-<w:comments xmlns:wpc="http://schemas.microsoft.com/office/word/2010/wordprocessingCanvas" xmlns:cx="http://schemas.microsoft.com/office/drawing/2014/chartex" xmlns:cx1="http://schemas.microsoft.com/office/drawing/2015/9/8/chartex" xmlns:cx2="http://schemas.microsoft.com/office/drawing/2015/10/21/chartex" xmlns:cx3="http://schemas.microsoft.com/office/drawing/2016/5/9/chartex" xmlns:cx4="http://schemas.microsoft.com/office/drawing/2016/5/10/chartex" xmlns:cx5="http://schemas.microsoft.com/office/drawing/2016/5/11/chartex" xmlns:cx6="http://schemas.microsoft.com/office/drawing/2016/5/12/chartex" xmlns:cx7="http://schemas.microsoft.com/office/drawing/2016/5/13/chartex" xmlns:cx8="http://schemas.microsoft.com/office/drawing/2016/5/14/chartex" xmlns:mc="http://schemas.openxmlformats.org/markup-compatibility/2006" xmlns:aink="http://schemas.microsoft.com/office/drawing/2016/ink" xmlns:am3d="http://schemas.microsoft.com/office/drawing/2017/model3d" xmlns:o="urn:schemas-microsoft-com:office:office" xmlns:oel="http://schemas.microsoft.com/office/2019/extlst" xmlns:r="http://schemas.openxmlformats.org/officeDocument/2006/relationships" xmlns:m="http://schemas.openxmlformats.org/officeDocument/2006/math" xmlns:v="urn:schemas-microsoft-com:vml" xmlns:wp14="http://schemas.microsoft.com/office/word/2010/wordprocessingDrawing" xmlns:wp="http://schemas.openxmlformats.org/drawingml/2006/wordprocessingDrawing" xmlns:w10="urn:schemas-microsoft-com:office:word" xmlns:w="http://schemas.openxmlformats.org/wordprocessingml/2006/main" xmlns:w14="http://schemas.microsoft.com/office/word/2010/wordml" xmlns:w15="http://schemas.microsoft.com/office/word/2012/wordml" xmlns:w16cex="http://schemas.microsoft.com/office/word/2018/wordml/cex" xmlns:w16cid="http://schemas.microsoft.com/office/word/2016/wordml/cid" xmlns:w16="http://schemas.microsoft.com/office/word/2018/wordml" xmlns:w16du="http://schemas.microsoft.com/office/word/2023/wordml/word16du" xmlns:w16sdtdh="http://schemas.microsoft.com/office/word/2020/wordml/sdtdatahash" xmlns:w16sdtfl="http://schemas.microsoft.com/office/word/2024/wordml/sdtformatlock" xmlns:w16se="http://schemas.microsoft.com/office/word/2015/wordml/symex" xmlns:wpg="http://schemas.microsoft.com/office/word/2010/wordprocessingGroup" xmlns:wpi="http://schemas.microsoft.com/office/word/2010/wordprocessingInk" xmlns:wne="http://schemas.microsoft.com/office/word/2006/wordml" xmlns:wps="http://schemas.microsoft.com/office/word/2010/wordprocessingShape" mc:Ignorable="w14 w15 w16se w16cid w16 w16cex w16sdtdh w16sdtfl w16du wp14">
+<w:comments xmlns:wpc="http://schemas.microsoft.com/office/word/2010/wordprocessingCanvas" xmlns:cx="http://schemas.microsoft.com/office/drawing/2014/chartex" xmlns:cx1="http://schemas.microsoft.com/office/drawing/2015/9/8/chartex" xmlns:cx2="http://schemas.microsoft.com/office/drawing/2015/10/21/chartex" xmlns:cx3="http://schemas.microsoft.com/office/drawing/2016/5/9/chartex" xmlns:cx4="http://schemas.microsoft.com/office/drawing/2016/5/10/chartex" xmlns:cx5="http://schemas.microsoft.com/office/drawing/2016/5/11/chartex" xmlns:cx6="http://schemas.microsoft.com/office/drawing/2016/5/12/chartex" xmlns:cx7="http://schemas.microsoft.com/office/drawing/2016/5/13/chartex" xmlns:cx8="http://schemas.microsoft.com/office/drawing/2016/5/14/chartex" xmlns:mc="http://schemas.openxmlformats.org/markup-compatibility/2006" xmlns:aink="http://schemas.microsoft.com/office/drawing/2016/ink" xmlns:am3d="http://schemas.microsoft.com/office/drawing/2017/model3d" xmlns:o="urn:schemas-microsoft-com:office:office" xmlns:oel="http://schemas.microsoft.com/office/2019/extlst" xmlns:r="http://schemas.openxmlformats.org/officeDocument/2006/relationships" xmlns:m="http://schemas.openxmlformats.org/officeDocument/2006/math" xmlns:v="urn:schemas-microsoft-com:vml" xmlns:wp14="http://schemas.microsoft.com/office/word/2010/wordprocessingDrawing" xmlns:wp="http://schemas.openxmlformats.org/drawingml/2006/wordprocessingDrawing" xmlns:w10="urn:schemas-microsoft-com:office:word" xmlns:w="http://schemas.openxmlformats.org/wordprocessingml/2006/main" xmlns:w14="http://schemas.microsoft.com/office/word/2010/wordml" xmlns:w15="http://schemas.microsoft.com/office/word/2012/wordml" xmlns:w16cex="http://schemas.microsoft.com/office/word/2018/wordml/cex" xmlns:w16cid="http://schemas.microsoft.com/office/word/2016/wordml/cid" xmlns:w16="http://schemas.microsoft.com/office/word/2018/wordml" xmlns:w16sdtdh="http://schemas.microsoft.com/office/word/2020/wordml/sdtdatahash" xmlns:w16se="http://schemas.microsoft.com/office/word/2015/wordml/symex" xmlns:wpg="http://schemas.microsoft.com/office/word/2010/wordprocessingGroup" xmlns:wpi="http://schemas.microsoft.com/office/word/2010/wordprocessingInk" xmlns:wne="http://schemas.microsoft.com/office/word/2006/wordml" xmlns:wps="http://schemas.microsoft.com/office/word/2010/wordprocessingShape" mc:Ignorable="w14 w15 w16se w16cid w16 w16cex w16sdtdh wp14">
   <w:comment w:id="1" w:author="Pamela D Riviere" w:date="2026-02-27T11:56:00Z" w:initials="PDR">
     <w:p>
       <w:r>
@@ -1807,7 +1764,23 @@
           <w:sz w:val="20"/>
           <w:szCs w:val="20"/>
         </w:rPr>
-        <w:t>you can run &gt;&gt; uname -m in bash shell to figure out your device's architecture</w:t>
+        <w:t xml:space="preserve">you can run &gt;&gt; </w:t>
+      </w:r>
+      <w:proofErr w:type="spellStart"/>
+      <w:r>
+        <w:rPr>
+          <w:sz w:val="20"/>
+          <w:szCs w:val="20"/>
+        </w:rPr>
+        <w:t>uname</w:t>
+      </w:r>
+      <w:proofErr w:type="spellEnd"/>
+      <w:r>
+        <w:rPr>
+          <w:sz w:val="20"/>
+          <w:szCs w:val="20"/>
+        </w:rPr>
+        <w:t xml:space="preserve"> -m in bash shell to figure out your device's architecture</w:t>
       </w:r>
     </w:p>
   </w:comment>
@@ -1824,7 +1797,23 @@
           <w:sz w:val="20"/>
           <w:szCs w:val="20"/>
         </w:rPr>
-        <w:t>to check Anaconda distribution: &gt;&gt; conda info</w:t>
+        <w:t xml:space="preserve">to check Anaconda distribution: &gt;&gt; </w:t>
+      </w:r>
+      <w:proofErr w:type="spellStart"/>
+      <w:r>
+        <w:rPr>
+          <w:sz w:val="20"/>
+          <w:szCs w:val="20"/>
+        </w:rPr>
+        <w:t>conda</w:t>
+      </w:r>
+      <w:proofErr w:type="spellEnd"/>
+      <w:r>
+        <w:rPr>
+          <w:sz w:val="20"/>
+          <w:szCs w:val="20"/>
+        </w:rPr>
+        <w:t xml:space="preserve"> info</w:t>
       </w:r>
     </w:p>
     <w:p/>
@@ -1851,7 +1840,7 @@
 </file>
 
 <file path=word/commentsExtended.xml><?xml version="1.0" encoding="utf-8"?>
-<w15:commentsEx xmlns:wpc="http://schemas.microsoft.com/office/word/2010/wordprocessingCanvas" xmlns:cx="http://schemas.microsoft.com/office/drawing/2014/chartex" xmlns:cx1="http://schemas.microsoft.com/office/drawing/2015/9/8/chartex" xmlns:cx2="http://schemas.microsoft.com/office/drawing/2015/10/21/chartex" xmlns:cx3="http://schemas.microsoft.com/office/drawing/2016/5/9/chartex" xmlns:cx4="http://schemas.microsoft.com/office/drawing/2016/5/10/chartex" xmlns:cx5="http://schemas.microsoft.com/office/drawing/2016/5/11/chartex" xmlns:cx6="http://schemas.microsoft.com/office/drawing/2016/5/12/chartex" xmlns:cx7="http://schemas.microsoft.com/office/drawing/2016/5/13/chartex" xmlns:cx8="http://schemas.microsoft.com/office/drawing/2016/5/14/chartex" xmlns:mc="http://schemas.openxmlformats.org/markup-compatibility/2006" xmlns:aink="http://schemas.microsoft.com/office/drawing/2016/ink" xmlns:am3d="http://schemas.microsoft.com/office/drawing/2017/model3d" xmlns:o="urn:schemas-microsoft-com:office:office" xmlns:oel="http://schemas.microsoft.com/office/2019/extlst" xmlns:r="http://schemas.openxmlformats.org/officeDocument/2006/relationships" xmlns:m="http://schemas.openxmlformats.org/officeDocument/2006/math" xmlns:v="urn:schemas-microsoft-com:vml" xmlns:wp14="http://schemas.microsoft.com/office/word/2010/wordprocessingDrawing" xmlns:wp="http://schemas.openxmlformats.org/drawingml/2006/wordprocessingDrawing" xmlns:w10="urn:schemas-microsoft-com:office:word" xmlns:w="http://schemas.openxmlformats.org/wordprocessingml/2006/main" xmlns:w14="http://schemas.microsoft.com/office/word/2010/wordml" xmlns:w15="http://schemas.microsoft.com/office/word/2012/wordml" xmlns:w16cex="http://schemas.microsoft.com/office/word/2018/wordml/cex" xmlns:w16cid="http://schemas.microsoft.com/office/word/2016/wordml/cid" xmlns:w16="http://schemas.microsoft.com/office/word/2018/wordml" xmlns:w16du="http://schemas.microsoft.com/office/word/2023/wordml/word16du" xmlns:w16sdtdh="http://schemas.microsoft.com/office/word/2020/wordml/sdtdatahash" xmlns:w16sdtfl="http://schemas.microsoft.com/office/word/2024/wordml/sdtformatlock" xmlns:w16se="http://schemas.microsoft.com/office/word/2015/wordml/symex" xmlns:wpg="http://schemas.microsoft.com/office/word/2010/wordprocessingGroup" xmlns:wpi="http://schemas.microsoft.com/office/word/2010/wordprocessingInk" xmlns:wne="http://schemas.microsoft.com/office/word/2006/wordml" xmlns:wps="http://schemas.microsoft.com/office/word/2010/wordprocessingShape" mc:Ignorable="w14 w15 w16se w16cid w16 w16cex w16sdtdh w16sdtfl w16du wp14">
+<w15:commentsEx xmlns:wpc="http://schemas.microsoft.com/office/word/2010/wordprocessingCanvas" xmlns:cx="http://schemas.microsoft.com/office/drawing/2014/chartex" xmlns:cx1="http://schemas.microsoft.com/office/drawing/2015/9/8/chartex" xmlns:cx2="http://schemas.microsoft.com/office/drawing/2015/10/21/chartex" xmlns:cx3="http://schemas.microsoft.com/office/drawing/2016/5/9/chartex" xmlns:cx4="http://schemas.microsoft.com/office/drawing/2016/5/10/chartex" xmlns:cx5="http://schemas.microsoft.com/office/drawing/2016/5/11/chartex" xmlns:cx6="http://schemas.microsoft.com/office/drawing/2016/5/12/chartex" xmlns:cx7="http://schemas.microsoft.com/office/drawing/2016/5/13/chartex" xmlns:cx8="http://schemas.microsoft.com/office/drawing/2016/5/14/chartex" xmlns:mc="http://schemas.openxmlformats.org/markup-compatibility/2006" xmlns:aink="http://schemas.microsoft.com/office/drawing/2016/ink" xmlns:am3d="http://schemas.microsoft.com/office/drawing/2017/model3d" xmlns:o="urn:schemas-microsoft-com:office:office" xmlns:oel="http://schemas.microsoft.com/office/2019/extlst" xmlns:r="http://schemas.openxmlformats.org/officeDocument/2006/relationships" xmlns:m="http://schemas.openxmlformats.org/officeDocument/2006/math" xmlns:v="urn:schemas-microsoft-com:vml" xmlns:wp14="http://schemas.microsoft.com/office/word/2010/wordprocessingDrawing" xmlns:wp="http://schemas.openxmlformats.org/drawingml/2006/wordprocessingDrawing" xmlns:w10="urn:schemas-microsoft-com:office:word" xmlns:w="http://schemas.openxmlformats.org/wordprocessingml/2006/main" xmlns:w14="http://schemas.microsoft.com/office/word/2010/wordml" xmlns:w15="http://schemas.microsoft.com/office/word/2012/wordml" xmlns:w16cex="http://schemas.microsoft.com/office/word/2018/wordml/cex" xmlns:w16cid="http://schemas.microsoft.com/office/word/2016/wordml/cid" xmlns:w16="http://schemas.microsoft.com/office/word/2018/wordml" xmlns:w16sdtdh="http://schemas.microsoft.com/office/word/2020/wordml/sdtdatahash" xmlns:w16se="http://schemas.microsoft.com/office/word/2015/wordml/symex" xmlns:wpg="http://schemas.microsoft.com/office/word/2010/wordprocessingGroup" xmlns:wpi="http://schemas.microsoft.com/office/word/2010/wordprocessingInk" xmlns:wne="http://schemas.microsoft.com/office/word/2006/wordml" xmlns:wps="http://schemas.microsoft.com/office/word/2010/wordprocessingShape" mc:Ignorable="w14 w15 w16se w16cid w16 w16cex w16sdtdh wp14">
   <w15:commentEx w15:paraId="3817DCA9" w15:done="0"/>
   <w15:commentEx w15:paraId="69FE89AA" w15:paraIdParent="3817DCA9" w15:done="0"/>
   <w15:commentEx w15:paraId="544ACBE9" w15:paraIdParent="3817DCA9" w15:done="0"/>
@@ -1859,7 +1848,7 @@
 </file>
 
 <file path=word/commentsExtensible.xml><?xml version="1.0" encoding="utf-8"?>
-<w16cex:commentsExtensible xmlns:wpc="http://schemas.microsoft.com/office/word/2010/wordprocessingCanvas" xmlns:cx="http://schemas.microsoft.com/office/drawing/2014/chartex" xmlns:cx1="http://schemas.microsoft.com/office/drawing/2015/9/8/chartex" xmlns:cx2="http://schemas.microsoft.com/office/drawing/2015/10/21/chartex" xmlns:cx3="http://schemas.microsoft.com/office/drawing/2016/5/9/chartex" xmlns:cx4="http://schemas.microsoft.com/office/drawing/2016/5/10/chartex" xmlns:cx5="http://schemas.microsoft.com/office/drawing/2016/5/11/chartex" xmlns:cx6="http://schemas.microsoft.com/office/drawing/2016/5/12/chartex" xmlns:cx7="http://schemas.microsoft.com/office/drawing/2016/5/13/chartex" xmlns:cx8="http://schemas.microsoft.com/office/drawing/2016/5/14/chartex" xmlns:cr="http://schemas.microsoft.com/office/comments/2020/reactions" xmlns:mc="http://schemas.openxmlformats.org/markup-compatibility/2006" xmlns:aink="http://schemas.microsoft.com/office/drawing/2016/ink" xmlns:am3d="http://schemas.microsoft.com/office/drawing/2017/model3d" xmlns:o="urn:schemas-microsoft-com:office:office" xmlns:oel="http://schemas.microsoft.com/office/2019/extlst" xmlns:r="http://schemas.openxmlformats.org/officeDocument/2006/relationships" xmlns:m="http://schemas.openxmlformats.org/officeDocument/2006/math" xmlns:v="urn:schemas-microsoft-com:vml" xmlns:wp14="http://schemas.microsoft.com/office/word/2010/wordprocessingDrawing" xmlns:wp="http://schemas.openxmlformats.org/drawingml/2006/wordprocessingDrawing" xmlns:w10="urn:schemas-microsoft-com:office:word" xmlns:w="http://schemas.openxmlformats.org/wordprocessingml/2006/main" xmlns:w14="http://schemas.microsoft.com/office/word/2010/wordml" xmlns:w15="http://schemas.microsoft.com/office/word/2012/wordml" xmlns:w16cex="http://schemas.microsoft.com/office/word/2018/wordml/cex" xmlns:w16cid="http://schemas.microsoft.com/office/word/2016/wordml/cid" xmlns:w16="http://schemas.microsoft.com/office/word/2018/wordml" xmlns:w16du="http://schemas.microsoft.com/office/word/2023/wordml/word16du" xmlns:w16sdtdh="http://schemas.microsoft.com/office/word/2020/wordml/sdtdatahash" xmlns:w16sdtfl="http://schemas.microsoft.com/office/word/2024/wordml/sdtformatlock" xmlns:w16se="http://schemas.microsoft.com/office/word/2015/wordml/symex" xmlns:wpg="http://schemas.microsoft.com/office/word/2010/wordprocessingGroup" xmlns:wpi="http://schemas.microsoft.com/office/word/2010/wordprocessingInk" xmlns:wne="http://schemas.microsoft.com/office/word/2006/wordml" xmlns:wps="http://schemas.microsoft.com/office/word/2010/wordprocessingShape" mc:Ignorable="w14 w15 w16se w16cid w16 w16cex w16sdtdh w16sdtfl cr w16du wp14">
+<w16cex:commentsExtensible xmlns:wpc="http://schemas.microsoft.com/office/word/2010/wordprocessingCanvas" xmlns:cx="http://schemas.microsoft.com/office/drawing/2014/chartex" xmlns:cx1="http://schemas.microsoft.com/office/drawing/2015/9/8/chartex" xmlns:cx2="http://schemas.microsoft.com/office/drawing/2015/10/21/chartex" xmlns:cx3="http://schemas.microsoft.com/office/drawing/2016/5/9/chartex" xmlns:cx4="http://schemas.microsoft.com/office/drawing/2016/5/10/chartex" xmlns:cx5="http://schemas.microsoft.com/office/drawing/2016/5/11/chartex" xmlns:cx6="http://schemas.microsoft.com/office/drawing/2016/5/12/chartex" xmlns:cx7="http://schemas.microsoft.com/office/drawing/2016/5/13/chartex" xmlns:cx8="http://schemas.microsoft.com/office/drawing/2016/5/14/chartex" xmlns:mc="http://schemas.openxmlformats.org/markup-compatibility/2006" xmlns:aink="http://schemas.microsoft.com/office/drawing/2016/ink" xmlns:am3d="http://schemas.microsoft.com/office/drawing/2017/model3d" xmlns:o="urn:schemas-microsoft-com:office:office" xmlns:oel="http://schemas.microsoft.com/office/2019/extlst" xmlns:r="http://schemas.openxmlformats.org/officeDocument/2006/relationships" xmlns:m="http://schemas.openxmlformats.org/officeDocument/2006/math" xmlns:v="urn:schemas-microsoft-com:vml" xmlns:wp14="http://schemas.microsoft.com/office/word/2010/wordprocessingDrawing" xmlns:wp="http://schemas.openxmlformats.org/drawingml/2006/wordprocessingDrawing" xmlns:w10="urn:schemas-microsoft-com:office:word" xmlns:w="http://schemas.openxmlformats.org/wordprocessingml/2006/main" xmlns:w14="http://schemas.microsoft.com/office/word/2010/wordml" xmlns:w15="http://schemas.microsoft.com/office/word/2012/wordml" xmlns:w16cex="http://schemas.microsoft.com/office/word/2018/wordml/cex" xmlns:w16cid="http://schemas.microsoft.com/office/word/2016/wordml/cid" xmlns:w16="http://schemas.microsoft.com/office/word/2018/wordml" xmlns:w16sdtdh="http://schemas.microsoft.com/office/word/2020/wordml/sdtdatahash" xmlns:w16se="http://schemas.microsoft.com/office/word/2015/wordml/symex" xmlns:wpg="http://schemas.microsoft.com/office/word/2010/wordprocessingGroup" xmlns:wpi="http://schemas.microsoft.com/office/word/2010/wordprocessingInk" xmlns:wne="http://schemas.microsoft.com/office/word/2006/wordml" xmlns:wps="http://schemas.microsoft.com/office/word/2010/wordprocessingShape" mc:Ignorable="w14 w15 w16se w16cid w16 w16cex w16sdtdh wp14">
   <w16cex:commentExtensible w16cex:durableId="7A89D2ED" w16cex:dateUtc="2026-02-27T16:56:00Z"/>
   <w16cex:commentExtensible w16cex:durableId="2BA46822" w16cex:dateUtc="2026-02-27T17:06:00Z"/>
   <w16cex:commentExtensible w16cex:durableId="5D6BF24F" w16cex:dateUtc="2026-02-27T17:06:00Z"/>
@@ -1867,7 +1856,7 @@
 </file>
 
 <file path=word/commentsIds.xml><?xml version="1.0" encoding="utf-8"?>
-<w16cid:commentsIds xmlns:wpc="http://schemas.microsoft.com/office/word/2010/wordprocessingCanvas" xmlns:cx="http://schemas.microsoft.com/office/drawing/2014/chartex" xmlns:cx1="http://schemas.microsoft.com/office/drawing/2015/9/8/chartex" xmlns:cx2="http://schemas.microsoft.com/office/drawing/2015/10/21/chartex" xmlns:cx3="http://schemas.microsoft.com/office/drawing/2016/5/9/chartex" xmlns:cx4="http://schemas.microsoft.com/office/drawing/2016/5/10/chartex" xmlns:cx5="http://schemas.microsoft.com/office/drawing/2016/5/11/chartex" xmlns:cx6="http://schemas.microsoft.com/office/drawing/2016/5/12/chartex" xmlns:cx7="http://schemas.microsoft.com/office/drawing/2016/5/13/chartex" xmlns:cx8="http://schemas.microsoft.com/office/drawing/2016/5/14/chartex" xmlns:mc="http://schemas.openxmlformats.org/markup-compatibility/2006" xmlns:aink="http://schemas.microsoft.com/office/drawing/2016/ink" xmlns:am3d="http://schemas.microsoft.com/office/drawing/2017/model3d" xmlns:o="urn:schemas-microsoft-com:office:office" xmlns:oel="http://schemas.microsoft.com/office/2019/extlst" xmlns:r="http://schemas.openxmlformats.org/officeDocument/2006/relationships" xmlns:m="http://schemas.openxmlformats.org/officeDocument/2006/math" xmlns:v="urn:schemas-microsoft-com:vml" xmlns:wp14="http://schemas.microsoft.com/office/word/2010/wordprocessingDrawing" xmlns:wp="http://schemas.openxmlformats.org/drawingml/2006/wordprocessingDrawing" xmlns:w10="urn:schemas-microsoft-com:office:word" xmlns:w="http://schemas.openxmlformats.org/wordprocessingml/2006/main" xmlns:w14="http://schemas.microsoft.com/office/word/2010/wordml" xmlns:w15="http://schemas.microsoft.com/office/word/2012/wordml" xmlns:w16cex="http://schemas.microsoft.com/office/word/2018/wordml/cex" xmlns:w16cid="http://schemas.microsoft.com/office/word/2016/wordml/cid" xmlns:w16="http://schemas.microsoft.com/office/word/2018/wordml" xmlns:w16du="http://schemas.microsoft.com/office/word/2023/wordml/word16du" xmlns:w16sdtdh="http://schemas.microsoft.com/office/word/2020/wordml/sdtdatahash" xmlns:w16sdtfl="http://schemas.microsoft.com/office/word/2024/wordml/sdtformatlock" xmlns:w16se="http://schemas.microsoft.com/office/word/2015/wordml/symex" xmlns:wpg="http://schemas.microsoft.com/office/word/2010/wordprocessingGroup" xmlns:wpi="http://schemas.microsoft.com/office/word/2010/wordprocessingInk" xmlns:wne="http://schemas.microsoft.com/office/word/2006/wordml" xmlns:wps="http://schemas.microsoft.com/office/word/2010/wordprocessingShape" mc:Ignorable="w14 w15 w16se w16cid w16 w16cex w16sdtdh w16sdtfl w16du wp14">
+<w16cid:commentsIds xmlns:wpc="http://schemas.microsoft.com/office/word/2010/wordprocessingCanvas" xmlns:cx="http://schemas.microsoft.com/office/drawing/2014/chartex" xmlns:cx1="http://schemas.microsoft.com/office/drawing/2015/9/8/chartex" xmlns:cx2="http://schemas.microsoft.com/office/drawing/2015/10/21/chartex" xmlns:cx3="http://schemas.microsoft.com/office/drawing/2016/5/9/chartex" xmlns:cx4="http://schemas.microsoft.com/office/drawing/2016/5/10/chartex" xmlns:cx5="http://schemas.microsoft.com/office/drawing/2016/5/11/chartex" xmlns:cx6="http://schemas.microsoft.com/office/drawing/2016/5/12/chartex" xmlns:cx7="http://schemas.microsoft.com/office/drawing/2016/5/13/chartex" xmlns:cx8="http://schemas.microsoft.com/office/drawing/2016/5/14/chartex" xmlns:mc="http://schemas.openxmlformats.org/markup-compatibility/2006" xmlns:aink="http://schemas.microsoft.com/office/drawing/2016/ink" xmlns:am3d="http://schemas.microsoft.com/office/drawing/2017/model3d" xmlns:o="urn:schemas-microsoft-com:office:office" xmlns:oel="http://schemas.microsoft.com/office/2019/extlst" xmlns:r="http://schemas.openxmlformats.org/officeDocument/2006/relationships" xmlns:m="http://schemas.openxmlformats.org/officeDocument/2006/math" xmlns:v="urn:schemas-microsoft-com:vml" xmlns:wp14="http://schemas.microsoft.com/office/word/2010/wordprocessingDrawing" xmlns:wp="http://schemas.openxmlformats.org/drawingml/2006/wordprocessingDrawing" xmlns:w10="urn:schemas-microsoft-com:office:word" xmlns:w="http://schemas.openxmlformats.org/wordprocessingml/2006/main" xmlns:w14="http://schemas.microsoft.com/office/word/2010/wordml" xmlns:w15="http://schemas.microsoft.com/office/word/2012/wordml" xmlns:w16cex="http://schemas.microsoft.com/office/word/2018/wordml/cex" xmlns:w16cid="http://schemas.microsoft.com/office/word/2016/wordml/cid" xmlns:w16="http://schemas.microsoft.com/office/word/2018/wordml" xmlns:w16sdtdh="http://schemas.microsoft.com/office/word/2020/wordml/sdtdatahash" xmlns:w16se="http://schemas.microsoft.com/office/word/2015/wordml/symex" xmlns:wpg="http://schemas.microsoft.com/office/word/2010/wordprocessingGroup" xmlns:wpi="http://schemas.microsoft.com/office/word/2010/wordprocessingInk" xmlns:wne="http://schemas.microsoft.com/office/word/2006/wordml" xmlns:wps="http://schemas.microsoft.com/office/word/2010/wordprocessingShape" mc:Ignorable="w14 w15 w16se w16cid w16 w16cex w16sdtdh wp14">
   <w16cid:commentId w16cid:paraId="3817DCA9" w16cid:durableId="7A89D2ED"/>
   <w16cid:commentId w16cid:paraId="69FE89AA" w16cid:durableId="2BA46822"/>
   <w16cid:commentId w16cid:paraId="544ACBE9" w16cid:durableId="5D6BF24F"/>
@@ -1875,7 +1864,7 @@
 </file>
 
 <file path=word/numbering.xml><?xml version="1.0" encoding="utf-8"?>
-<w:numbering xmlns:wpc="http://schemas.microsoft.com/office/word/2010/wordprocessingCanvas" xmlns:cx="http://schemas.microsoft.com/office/drawing/2014/chartex" xmlns:cx1="http://schemas.microsoft.com/office/drawing/2015/9/8/chartex" xmlns:cx2="http://schemas.microsoft.com/office/drawing/2015/10/21/chartex" xmlns:cx3="http://schemas.microsoft.com/office/drawing/2016/5/9/chartex" xmlns:cx4="http://schemas.microsoft.com/office/drawing/2016/5/10/chartex" xmlns:cx5="http://schemas.microsoft.com/office/drawing/2016/5/11/chartex" xmlns:cx6="http://schemas.microsoft.com/office/drawing/2016/5/12/chartex" xmlns:cx7="http://schemas.microsoft.com/office/drawing/2016/5/13/chartex" xmlns:cx8="http://schemas.microsoft.com/office/drawing/2016/5/14/chartex" xmlns:mc="http://schemas.openxmlformats.org/markup-compatibility/2006" xmlns:aink="http://schemas.microsoft.com/office/drawing/2016/ink" xmlns:am3d="http://schemas.microsoft.com/office/drawing/2017/model3d" xmlns:o="urn:schemas-microsoft-com:office:office" xmlns:oel="http://schemas.microsoft.com/office/2019/extlst" xmlns:r="http://schemas.openxmlformats.org/officeDocument/2006/relationships" xmlns:m="http://schemas.openxmlformats.org/officeDocument/2006/math" xmlns:v="urn:schemas-microsoft-com:vml" xmlns:wp14="http://schemas.microsoft.com/office/word/2010/wordprocessingDrawing" xmlns:wp="http://schemas.openxmlformats.org/drawingml/2006/wordprocessingDrawing" xmlns:w10="urn:schemas-microsoft-com:office:word" xmlns:w="http://schemas.openxmlformats.org/wordprocessingml/2006/main" xmlns:w14="http://schemas.microsoft.com/office/word/2010/wordml" xmlns:w15="http://schemas.microsoft.com/office/word/2012/wordml" xmlns:w16cex="http://schemas.microsoft.com/office/word/2018/wordml/cex" xmlns:w16cid="http://schemas.microsoft.com/office/word/2016/wordml/cid" xmlns:w16="http://schemas.microsoft.com/office/word/2018/wordml" xmlns:w16du="http://schemas.microsoft.com/office/word/2023/wordml/word16du" xmlns:w16sdtdh="http://schemas.microsoft.com/office/word/2020/wordml/sdtdatahash" xmlns:w16sdtfl="http://schemas.microsoft.com/office/word/2024/wordml/sdtformatlock" xmlns:w16se="http://schemas.microsoft.com/office/word/2015/wordml/symex" xmlns:wpg="http://schemas.microsoft.com/office/word/2010/wordprocessingGroup" xmlns:wpi="http://schemas.microsoft.com/office/word/2010/wordprocessingInk" xmlns:wne="http://schemas.microsoft.com/office/word/2006/wordml" xmlns:wps="http://schemas.microsoft.com/office/word/2010/wordprocessingShape" mc:Ignorable="w14 w15 w16se w16cid w16 w16cex w16sdtdh w16sdtfl w16du wp14">
+<w:numbering xmlns:wpc="http://schemas.microsoft.com/office/word/2010/wordprocessingCanvas" xmlns:cx="http://schemas.microsoft.com/office/drawing/2014/chartex" xmlns:cx1="http://schemas.microsoft.com/office/drawing/2015/9/8/chartex" xmlns:cx2="http://schemas.microsoft.com/office/drawing/2015/10/21/chartex" xmlns:cx3="http://schemas.microsoft.com/office/drawing/2016/5/9/chartex" xmlns:cx4="http://schemas.microsoft.com/office/drawing/2016/5/10/chartex" xmlns:cx5="http://schemas.microsoft.com/office/drawing/2016/5/11/chartex" xmlns:cx6="http://schemas.microsoft.com/office/drawing/2016/5/12/chartex" xmlns:cx7="http://schemas.microsoft.com/office/drawing/2016/5/13/chartex" xmlns:cx8="http://schemas.microsoft.com/office/drawing/2016/5/14/chartex" xmlns:mc="http://schemas.openxmlformats.org/markup-compatibility/2006" xmlns:aink="http://schemas.microsoft.com/office/drawing/2016/ink" xmlns:am3d="http://schemas.microsoft.com/office/drawing/2017/model3d" xmlns:o="urn:schemas-microsoft-com:office:office" xmlns:oel="http://schemas.microsoft.com/office/2019/extlst" xmlns:r="http://schemas.openxmlformats.org/officeDocument/2006/relationships" xmlns:m="http://schemas.openxmlformats.org/officeDocument/2006/math" xmlns:v="urn:schemas-microsoft-com:vml" xmlns:wp14="http://schemas.microsoft.com/office/word/2010/wordprocessingDrawing" xmlns:wp="http://schemas.openxmlformats.org/drawingml/2006/wordprocessingDrawing" xmlns:w10="urn:schemas-microsoft-com:office:word" xmlns:w="http://schemas.openxmlformats.org/wordprocessingml/2006/main" xmlns:w14="http://schemas.microsoft.com/office/word/2010/wordml" xmlns:w15="http://schemas.microsoft.com/office/word/2012/wordml" xmlns:w16cex="http://schemas.microsoft.com/office/word/2018/wordml/cex" xmlns:w16cid="http://schemas.microsoft.com/office/word/2016/wordml/cid" xmlns:w16="http://schemas.microsoft.com/office/word/2018/wordml" xmlns:w16sdtdh="http://schemas.microsoft.com/office/word/2020/wordml/sdtdatahash" xmlns:w16se="http://schemas.microsoft.com/office/word/2015/wordml/symex" xmlns:wpg="http://schemas.microsoft.com/office/word/2010/wordprocessingGroup" xmlns:wpi="http://schemas.microsoft.com/office/word/2010/wordprocessingInk" xmlns:wne="http://schemas.microsoft.com/office/word/2006/wordml" xmlns:wps="http://schemas.microsoft.com/office/word/2010/wordprocessingShape" mc:Ignorable="w14 w15 w16se w16cid w16 w16cex w16sdtdh wp14">
   <w:abstractNum w:abstractNumId="0" w15:restartNumberingAfterBreak="0">
     <w:nsid w:val="0B1A0DB0"/>
     <w:multiLevelType w:val="hybridMultilevel"/>
@@ -2229,7 +2218,7 @@
 </file>
 
 <file path=word/people.xml><?xml version="1.0" encoding="utf-8"?>
-<w15:people xmlns:wpc="http://schemas.microsoft.com/office/word/2010/wordprocessingCanvas" xmlns:cx="http://schemas.microsoft.com/office/drawing/2014/chartex" xmlns:cx1="http://schemas.microsoft.com/office/drawing/2015/9/8/chartex" xmlns:cx2="http://schemas.microsoft.com/office/drawing/2015/10/21/chartex" xmlns:cx3="http://schemas.microsoft.com/office/drawing/2016/5/9/chartex" xmlns:cx4="http://schemas.microsoft.com/office/drawing/2016/5/10/chartex" xmlns:cx5="http://schemas.microsoft.com/office/drawing/2016/5/11/chartex" xmlns:cx6="http://schemas.microsoft.com/office/drawing/2016/5/12/chartex" xmlns:cx7="http://schemas.microsoft.com/office/drawing/2016/5/13/chartex" xmlns:cx8="http://schemas.microsoft.com/office/drawing/2016/5/14/chartex" xmlns:mc="http://schemas.openxmlformats.org/markup-compatibility/2006" xmlns:aink="http://schemas.microsoft.com/office/drawing/2016/ink" xmlns:am3d="http://schemas.microsoft.com/office/drawing/2017/model3d" xmlns:o="urn:schemas-microsoft-com:office:office" xmlns:oel="http://schemas.microsoft.com/office/2019/extlst" xmlns:r="http://schemas.openxmlformats.org/officeDocument/2006/relationships" xmlns:m="http://schemas.openxmlformats.org/officeDocument/2006/math" xmlns:v="urn:schemas-microsoft-com:vml" xmlns:wp14="http://schemas.microsoft.com/office/word/2010/wordprocessingDrawing" xmlns:wp="http://schemas.openxmlformats.org/drawingml/2006/wordprocessingDrawing" xmlns:w10="urn:schemas-microsoft-com:office:word" xmlns:w="http://schemas.openxmlformats.org/wordprocessingml/2006/main" xmlns:w14="http://schemas.microsoft.com/office/word/2010/wordml" xmlns:w15="http://schemas.microsoft.com/office/word/2012/wordml" xmlns:w16cex="http://schemas.microsoft.com/office/word/2018/wordml/cex" xmlns:w16cid="http://schemas.microsoft.com/office/word/2016/wordml/cid" xmlns:w16="http://schemas.microsoft.com/office/word/2018/wordml" xmlns:w16du="http://schemas.microsoft.com/office/word/2023/wordml/word16du" xmlns:w16sdtdh="http://schemas.microsoft.com/office/word/2020/wordml/sdtdatahash" xmlns:w16sdtfl="http://schemas.microsoft.com/office/word/2024/wordml/sdtformatlock" xmlns:w16se="http://schemas.microsoft.com/office/word/2015/wordml/symex" xmlns:wpg="http://schemas.microsoft.com/office/word/2010/wordprocessingGroup" xmlns:wpi="http://schemas.microsoft.com/office/word/2010/wordprocessingInk" xmlns:wne="http://schemas.microsoft.com/office/word/2006/wordml" xmlns:wps="http://schemas.microsoft.com/office/word/2010/wordprocessingShape" mc:Ignorable="w14 w15 w16se w16cid w16 w16cex w16sdtdh w16sdtfl w16du wp14">
+<w15:people xmlns:wpc="http://schemas.microsoft.com/office/word/2010/wordprocessingCanvas" xmlns:cx="http://schemas.microsoft.com/office/drawing/2014/chartex" xmlns:cx1="http://schemas.microsoft.com/office/drawing/2015/9/8/chartex" xmlns:cx2="http://schemas.microsoft.com/office/drawing/2015/10/21/chartex" xmlns:cx3="http://schemas.microsoft.com/office/drawing/2016/5/9/chartex" xmlns:cx4="http://schemas.microsoft.com/office/drawing/2016/5/10/chartex" xmlns:cx5="http://schemas.microsoft.com/office/drawing/2016/5/11/chartex" xmlns:cx6="http://schemas.microsoft.com/office/drawing/2016/5/12/chartex" xmlns:cx7="http://schemas.microsoft.com/office/drawing/2016/5/13/chartex" xmlns:cx8="http://schemas.microsoft.com/office/drawing/2016/5/14/chartex" xmlns:mc="http://schemas.openxmlformats.org/markup-compatibility/2006" xmlns:aink="http://schemas.microsoft.com/office/drawing/2016/ink" xmlns:am3d="http://schemas.microsoft.com/office/drawing/2017/model3d" xmlns:o="urn:schemas-microsoft-com:office:office" xmlns:oel="http://schemas.microsoft.com/office/2019/extlst" xmlns:r="http://schemas.openxmlformats.org/officeDocument/2006/relationships" xmlns:m="http://schemas.openxmlformats.org/officeDocument/2006/math" xmlns:v="urn:schemas-microsoft-com:vml" xmlns:wp14="http://schemas.microsoft.com/office/word/2010/wordprocessingDrawing" xmlns:wp="http://schemas.openxmlformats.org/drawingml/2006/wordprocessingDrawing" xmlns:w10="urn:schemas-microsoft-com:office:word" xmlns:w="http://schemas.openxmlformats.org/wordprocessingml/2006/main" xmlns:w14="http://schemas.microsoft.com/office/word/2010/wordml" xmlns:w15="http://schemas.microsoft.com/office/word/2012/wordml" xmlns:w16cex="http://schemas.microsoft.com/office/word/2018/wordml/cex" xmlns:w16cid="http://schemas.microsoft.com/office/word/2016/wordml/cid" xmlns:w16="http://schemas.microsoft.com/office/word/2018/wordml" xmlns:w16sdtdh="http://schemas.microsoft.com/office/word/2020/wordml/sdtdatahash" xmlns:w16se="http://schemas.microsoft.com/office/word/2015/wordml/symex" xmlns:wpg="http://schemas.microsoft.com/office/word/2010/wordprocessingGroup" xmlns:wpi="http://schemas.microsoft.com/office/word/2010/wordprocessingInk" xmlns:wne="http://schemas.microsoft.com/office/word/2006/wordml" xmlns:wps="http://schemas.microsoft.com/office/word/2010/wordprocessingShape" mc:Ignorable="w14 w15 w16se w16cid w16 w16cex w16sdtdh wp14">
   <w15:person w15:author="Pamela D Riviere">
     <w15:presenceInfo w15:providerId="AD" w15:userId="S::pdrivier@UCSD.EDU::a5d1394f-fb00-4bb3-8752-1248490c5de1"/>
   </w15:person>
@@ -2237,7 +2226,7 @@
 </file>
 
 <file path=word/styles.xml><?xml version="1.0" encoding="utf-8"?>
-<w:styles xmlns:mc="http://schemas.openxmlformats.org/markup-compatibility/2006" xmlns:r="http://schemas.openxmlformats.org/officeDocument/2006/relationships" xmlns:w="http://schemas.openxmlformats.org/wordprocessingml/2006/main" xmlns:w14="http://schemas.microsoft.com/office/word/2010/wordml" xmlns:w15="http://schemas.microsoft.com/office/word/2012/wordml" xmlns:w16cex="http://schemas.microsoft.com/office/word/2018/wordml/cex" xmlns:w16cid="http://schemas.microsoft.com/office/word/2016/wordml/cid" xmlns:w16="http://schemas.microsoft.com/office/word/2018/wordml" xmlns:w16du="http://schemas.microsoft.com/office/word/2023/wordml/word16du" xmlns:w16sdtdh="http://schemas.microsoft.com/office/word/2020/wordml/sdtdatahash" xmlns:w16sdtfl="http://schemas.microsoft.com/office/word/2024/wordml/sdtformatlock" xmlns:w16se="http://schemas.microsoft.com/office/word/2015/wordml/symex" mc:Ignorable="w14 w15 w16se w16cid w16 w16cex w16sdtdh w16sdtfl w16du">
+<w:styles xmlns:mc="http://schemas.openxmlformats.org/markup-compatibility/2006" xmlns:r="http://schemas.openxmlformats.org/officeDocument/2006/relationships" xmlns:w="http://schemas.openxmlformats.org/wordprocessingml/2006/main" xmlns:w14="http://schemas.microsoft.com/office/word/2010/wordml" xmlns:w15="http://schemas.microsoft.com/office/word/2012/wordml" xmlns:w16cex="http://schemas.microsoft.com/office/word/2018/wordml/cex" xmlns:w16cid="http://schemas.microsoft.com/office/word/2016/wordml/cid" xmlns:w16="http://schemas.microsoft.com/office/word/2018/wordml" xmlns:w16sdtdh="http://schemas.microsoft.com/office/word/2020/wordml/sdtdatahash" xmlns:w16se="http://schemas.microsoft.com/office/word/2015/wordml/symex" mc:Ignorable="w14 w15 w16se w16cid w16 w16cex w16sdtdh">
   <w:docDefaults>
     <w:rPrDefault>
       <w:rPr>

</xml_diff>

<commit_message>
update: keep some boundary embeds
</commit_message>
<xml_diff>
--- a/project-overview/todo.docx
+++ b/project-overview/todo.docx
@@ -557,20 +557,582 @@
     <w:p>
       <w:pPr>
         <w:pStyle w:val="ListParagraph"/>
-        <w:rPr>
-          <w:rFonts w:ascii="Andale Mono" w:hAnsi="Andale Mono"/>
-          <w:color w:val="000000" w:themeColor="text1"/>
-        </w:rPr>
-      </w:pPr>
+        <w:numPr>
+          <w:ilvl w:val="0"/>
+          <w:numId w:val="3"/>
+        </w:numPr>
+        <w:rPr>
+          <w:rFonts w:ascii="Andale Mono" w:hAnsi="Andale Mono"/>
+          <w:color w:val="000000" w:themeColor="text1"/>
+        </w:rPr>
+      </w:pPr>
+      <w:r>
+        <w:rPr>
+          <w:rFonts w:ascii="Andale Mono" w:hAnsi="Andale Mono" w:cs="Andale Mono"/>
+          <w:color w:val="000000" w:themeColor="text1"/>
+          <w:kern w:val="0"/>
+          <w:sz w:val="22"/>
+          <w:szCs w:val="22"/>
+        </w:rPr>
+        <w:t xml:space="preserve">(04/21) DRAFTING the </w:t>
+      </w:r>
+      <w:proofErr w:type="spellStart"/>
+      <w:r>
+        <w:rPr>
+          <w:rFonts w:ascii="Andale Mono" w:hAnsi="Andale Mono" w:cs="Andale Mono"/>
+          <w:color w:val="000000" w:themeColor="text1"/>
+          <w:kern w:val="0"/>
+          <w:sz w:val="22"/>
+          <w:szCs w:val="22"/>
+        </w:rPr>
+        <w:t>BoundaryAwareSplitt</w:t>
+      </w:r>
+      <w:r>
+        <w:rPr>
+          <w:rFonts w:ascii="Andale Mono" w:hAnsi="Andale Mono" w:cs="Andale Mono"/>
+          <w:color w:val="000000" w:themeColor="text1"/>
+          <w:kern w:val="0"/>
+          <w:sz w:val="22"/>
+          <w:szCs w:val="22"/>
+        </w:rPr>
+        <w:t>er</w:t>
+      </w:r>
+      <w:proofErr w:type="spellEnd"/>
+      <w:r>
+        <w:rPr>
+          <w:rFonts w:ascii="Andale Mono" w:hAnsi="Andale Mono" w:cs="Andale Mono"/>
+          <w:color w:val="000000" w:themeColor="text1"/>
+          <w:kern w:val="0"/>
+          <w:sz w:val="22"/>
+          <w:szCs w:val="22"/>
+        </w:rPr>
+        <w:t xml:space="preserve"> block within model.py – need to be able to split the word embeddings smartly back into constituent phonemes</w:t>
+      </w:r>
+      <w:r>
+        <w:rPr>
+          <w:rFonts w:ascii="Andale Mono" w:hAnsi="Andale Mono" w:cs="Andale Mono"/>
+          <w:color w:val="000000" w:themeColor="text1"/>
+          <w:kern w:val="0"/>
+          <w:sz w:val="22"/>
+          <w:szCs w:val="22"/>
+        </w:rPr>
+        <w:t>—this block needs to be aware of punctuation, and also perhaps the original phoneme embeddings via a long-range skip connection</w:t>
+      </w:r>
+      <w:r>
+        <w:rPr>
+          <w:rFonts w:ascii="Andale Mono" w:hAnsi="Andale Mono" w:cs="Andale Mono"/>
+          <w:color w:val="000000" w:themeColor="text1"/>
+          <w:kern w:val="0"/>
+          <w:sz w:val="22"/>
+          <w:szCs w:val="22"/>
+        </w:rPr>
+        <w:t xml:space="preserve">, to avoid spiraling away? </w:t>
+      </w:r>
+      <w:r>
+        <w:rPr>
+          <w:rFonts w:ascii="Andale Mono" w:hAnsi="Andale Mono" w:cs="Andale Mono"/>
+          <w:color w:val="000000" w:themeColor="text1"/>
+          <w:kern w:val="0"/>
+          <w:sz w:val="22"/>
+          <w:szCs w:val="22"/>
+        </w:rPr>
+        <w:t xml:space="preserve">– conceptual BREAKTHROUGH: for every position where there should be a phoneme (as per the original sequence), I’ll copy the word embedding as many times, and then add in the original corresponding phoneme for that position from a skip connection that comes in after the first </w:t>
+      </w:r>
+      <w:proofErr w:type="spellStart"/>
+      <w:r>
+        <w:rPr>
+          <w:rFonts w:ascii="Andale Mono" w:hAnsi="Andale Mono" w:cs="Andale Mono"/>
+          <w:color w:val="000000" w:themeColor="text1"/>
+          <w:kern w:val="0"/>
+          <w:sz w:val="22"/>
+          <w:szCs w:val="22"/>
+        </w:rPr>
+        <w:t>PhonemeTransformer</w:t>
+      </w:r>
+      <w:proofErr w:type="spellEnd"/>
+      <w:r>
+        <w:rPr>
+          <w:rFonts w:ascii="Andale Mono" w:hAnsi="Andale Mono" w:cs="Andale Mono"/>
+          <w:color w:val="000000" w:themeColor="text1"/>
+          <w:kern w:val="0"/>
+          <w:sz w:val="22"/>
+          <w:szCs w:val="22"/>
+        </w:rPr>
+        <w:t xml:space="preserve"> block!</w:t>
+      </w:r>
+      <w:r>
+        <w:rPr>
+          <w:rFonts w:ascii="Andale Mono" w:hAnsi="Andale Mono" w:cs="Andale Mono"/>
+          <w:color w:val="000000" w:themeColor="text1"/>
+          <w:kern w:val="0"/>
+          <w:sz w:val="22"/>
+          <w:szCs w:val="22"/>
+        </w:rPr>
+        <w:t xml:space="preserve"> &gt; this needs to account for the shift in token positions from the causal next-token-prediction setup</w:t>
+      </w:r>
+      <w:r>
+        <w:rPr>
+          <w:rFonts w:ascii="Andale Mono" w:hAnsi="Andale Mono" w:cs="Andale Mono"/>
+          <w:color w:val="000000" w:themeColor="text1"/>
+          <w:kern w:val="0"/>
+          <w:sz w:val="22"/>
+          <w:szCs w:val="22"/>
+        </w:rPr>
+        <w:t xml:space="preserve"> –</w:t>
+      </w:r>
     </w:p>
     <w:p>
       <w:pPr>
         <w:pStyle w:val="ListParagraph"/>
-        <w:rPr>
-          <w:b/>
-          <w:bCs/>
-        </w:rPr>
-      </w:pPr>
+        <w:numPr>
+          <w:ilvl w:val="1"/>
+          <w:numId w:val="3"/>
+        </w:numPr>
+        <w:rPr>
+          <w:rFonts w:ascii="Andale Mono" w:hAnsi="Andale Mono"/>
+          <w:color w:val="000000" w:themeColor="text1"/>
+        </w:rPr>
+      </w:pPr>
+      <w:r>
+        <w:rPr>
+          <w:rFonts w:ascii="Andale Mono" w:hAnsi="Andale Mono" w:cs="Andale Mono"/>
+          <w:color w:val="000000" w:themeColor="text1"/>
+          <w:kern w:val="0"/>
+          <w:sz w:val="22"/>
+          <w:szCs w:val="22"/>
+        </w:rPr>
+        <w:t xml:space="preserve">For positional embeddings later on: handle this in </w:t>
+      </w:r>
+      <w:proofErr w:type="spellStart"/>
+      <w:r>
+        <w:rPr>
+          <w:rFonts w:ascii="Andale Mono" w:hAnsi="Andale Mono" w:cs="Andale Mono"/>
+          <w:color w:val="000000" w:themeColor="text1"/>
+          <w:kern w:val="0"/>
+          <w:sz w:val="22"/>
+          <w:szCs w:val="22"/>
+        </w:rPr>
+        <w:t>PhonemeLM.forward</w:t>
+      </w:r>
+      <w:proofErr w:type="spellEnd"/>
+    </w:p>
+    <w:p>
+      <w:pPr>
+        <w:pStyle w:val="ListParagraph"/>
+        <w:numPr>
+          <w:ilvl w:val="1"/>
+          <w:numId w:val="3"/>
+        </w:numPr>
+        <w:rPr>
+          <w:rFonts w:ascii="Andale Mono" w:hAnsi="Andale Mono"/>
+          <w:color w:val="000000" w:themeColor="text1"/>
+        </w:rPr>
+      </w:pPr>
+      <w:r>
+        <w:rPr>
+          <w:rFonts w:ascii="Andale Mono" w:hAnsi="Andale Mono" w:cs="Andale Mono"/>
+          <w:color w:val="000000" w:themeColor="text1"/>
+          <w:kern w:val="0"/>
+          <w:sz w:val="22"/>
+          <w:szCs w:val="22"/>
+        </w:rPr>
+        <w:t xml:space="preserve"># in </w:t>
+      </w:r>
+      <w:proofErr w:type="spellStart"/>
+      <w:r>
+        <w:rPr>
+          <w:rFonts w:ascii="Andale Mono" w:hAnsi="Andale Mono" w:cs="Andale Mono"/>
+          <w:color w:val="000000" w:themeColor="text1"/>
+          <w:kern w:val="0"/>
+          <w:sz w:val="22"/>
+          <w:szCs w:val="22"/>
+        </w:rPr>
+        <w:t>PhonemeLM.forward</w:t>
+      </w:r>
+      <w:proofErr w:type="spellEnd"/>
+      <w:r>
+        <w:rPr>
+          <w:rFonts w:ascii="Andale Mono" w:hAnsi="Andale Mono" w:cs="Andale Mono"/>
+          <w:color w:val="000000" w:themeColor="text1"/>
+          <w:kern w:val="0"/>
+          <w:sz w:val="22"/>
+          <w:szCs w:val="22"/>
+        </w:rPr>
+        <w:t xml:space="preserve">, after </w:t>
+      </w:r>
+      <w:proofErr w:type="spellStart"/>
+      <w:r>
+        <w:rPr>
+          <w:rFonts w:ascii="Andale Mono" w:hAnsi="Andale Mono" w:cs="Andale Mono"/>
+          <w:color w:val="000000" w:themeColor="text1"/>
+          <w:kern w:val="0"/>
+          <w:sz w:val="22"/>
+          <w:szCs w:val="22"/>
+        </w:rPr>
+        <w:t>upsampling</w:t>
+      </w:r>
+      <w:proofErr w:type="spellEnd"/>
+    </w:p>
+    <w:p>
+      <w:pPr>
+        <w:pStyle w:val="ListParagraph"/>
+        <w:numPr>
+          <w:ilvl w:val="1"/>
+          <w:numId w:val="3"/>
+        </w:numPr>
+        <w:rPr>
+          <w:rFonts w:ascii="Andale Mono" w:hAnsi="Andale Mono"/>
+          <w:color w:val="000000" w:themeColor="text1"/>
+        </w:rPr>
+      </w:pPr>
+      <w:r>
+        <w:rPr>
+          <w:rFonts w:ascii="Andale Mono" w:hAnsi="Andale Mono" w:cs="Andale Mono"/>
+          <w:color w:val="000000" w:themeColor="text1"/>
+          <w:kern w:val="0"/>
+          <w:sz w:val="22"/>
+          <w:szCs w:val="22"/>
+        </w:rPr>
+        <w:t xml:space="preserve">x = </w:t>
+      </w:r>
+      <w:proofErr w:type="spellStart"/>
+      <w:proofErr w:type="gramStart"/>
+      <w:r>
+        <w:rPr>
+          <w:rFonts w:ascii="Andale Mono" w:hAnsi="Andale Mono" w:cs="Andale Mono"/>
+          <w:color w:val="000000" w:themeColor="text1"/>
+          <w:kern w:val="0"/>
+          <w:sz w:val="22"/>
+          <w:szCs w:val="22"/>
+        </w:rPr>
+        <w:t>self.splitter</w:t>
+      </w:r>
+      <w:proofErr w:type="spellEnd"/>
+      <w:proofErr w:type="gramEnd"/>
+      <w:r>
+        <w:rPr>
+          <w:rFonts w:ascii="Andale Mono" w:hAnsi="Andale Mono" w:cs="Andale Mono"/>
+          <w:color w:val="000000" w:themeColor="text1"/>
+          <w:kern w:val="0"/>
+          <w:sz w:val="22"/>
+          <w:szCs w:val="22"/>
+        </w:rPr>
+        <w:t>(</w:t>
+      </w:r>
+      <w:proofErr w:type="spellStart"/>
+      <w:r>
+        <w:rPr>
+          <w:rFonts w:ascii="Andale Mono" w:hAnsi="Andale Mono" w:cs="Andale Mono"/>
+          <w:color w:val="000000" w:themeColor="text1"/>
+          <w:kern w:val="0"/>
+          <w:sz w:val="22"/>
+          <w:szCs w:val="22"/>
+        </w:rPr>
+        <w:t>word_embeddings</w:t>
+      </w:r>
+      <w:proofErr w:type="spellEnd"/>
+      <w:r>
+        <w:rPr>
+          <w:rFonts w:ascii="Andale Mono" w:hAnsi="Andale Mono" w:cs="Andale Mono"/>
+          <w:color w:val="000000" w:themeColor="text1"/>
+          <w:kern w:val="0"/>
+          <w:sz w:val="22"/>
+          <w:szCs w:val="22"/>
+        </w:rPr>
+        <w:t xml:space="preserve">, </w:t>
+      </w:r>
+      <w:proofErr w:type="spellStart"/>
+      <w:r>
+        <w:rPr>
+          <w:rFonts w:ascii="Andale Mono" w:hAnsi="Andale Mono" w:cs="Andale Mono"/>
+          <w:color w:val="000000" w:themeColor="text1"/>
+          <w:kern w:val="0"/>
+          <w:sz w:val="22"/>
+          <w:szCs w:val="22"/>
+        </w:rPr>
+        <w:t>phoneme_skip</w:t>
+      </w:r>
+      <w:proofErr w:type="spellEnd"/>
+      <w:r>
+        <w:rPr>
+          <w:rFonts w:ascii="Andale Mono" w:hAnsi="Andale Mono" w:cs="Andale Mono"/>
+          <w:color w:val="000000" w:themeColor="text1"/>
+          <w:kern w:val="0"/>
+          <w:sz w:val="22"/>
+          <w:szCs w:val="22"/>
+        </w:rPr>
+        <w:t xml:space="preserve">, </w:t>
+      </w:r>
+      <w:proofErr w:type="spellStart"/>
+      <w:r>
+        <w:rPr>
+          <w:rFonts w:ascii="Andale Mono" w:hAnsi="Andale Mono" w:cs="Andale Mono"/>
+          <w:color w:val="000000" w:themeColor="text1"/>
+          <w:kern w:val="0"/>
+          <w:sz w:val="22"/>
+          <w:szCs w:val="22"/>
+        </w:rPr>
+        <w:t>input_ids</w:t>
+      </w:r>
+      <w:proofErr w:type="spellEnd"/>
+      <w:r>
+        <w:rPr>
+          <w:rFonts w:ascii="Andale Mono" w:hAnsi="Andale Mono" w:cs="Andale Mono"/>
+          <w:color w:val="000000" w:themeColor="text1"/>
+          <w:kern w:val="0"/>
+          <w:sz w:val="22"/>
+          <w:szCs w:val="22"/>
+        </w:rPr>
+        <w:t>) # (B, D, T)</w:t>
+      </w:r>
+    </w:p>
+    <w:p>
+      <w:pPr>
+        <w:pStyle w:val="ListParagraph"/>
+        <w:numPr>
+          <w:ilvl w:val="1"/>
+          <w:numId w:val="3"/>
+        </w:numPr>
+        <w:rPr>
+          <w:rFonts w:ascii="Andale Mono" w:hAnsi="Andale Mono"/>
+          <w:color w:val="000000" w:themeColor="text1"/>
+        </w:rPr>
+      </w:pPr>
+      <w:r>
+        <w:rPr>
+          <w:rFonts w:ascii="Andale Mono" w:hAnsi="Andale Mono" w:cs="Andale Mono"/>
+          <w:color w:val="000000" w:themeColor="text1"/>
+          <w:kern w:val="0"/>
+          <w:sz w:val="22"/>
+          <w:szCs w:val="22"/>
+        </w:rPr>
+        <w:t xml:space="preserve"># </w:t>
+      </w:r>
+      <w:proofErr w:type="gramStart"/>
+      <w:r>
+        <w:rPr>
+          <w:rFonts w:ascii="Andale Mono" w:hAnsi="Andale Mono" w:cs="Andale Mono"/>
+          <w:color w:val="000000" w:themeColor="text1"/>
+          <w:kern w:val="0"/>
+          <w:sz w:val="22"/>
+          <w:szCs w:val="22"/>
+        </w:rPr>
+        <w:t>reintroduce</w:t>
+      </w:r>
+      <w:proofErr w:type="gramEnd"/>
+      <w:r>
+        <w:rPr>
+          <w:rFonts w:ascii="Andale Mono" w:hAnsi="Andale Mono" w:cs="Andale Mono"/>
+          <w:color w:val="000000" w:themeColor="text1"/>
+          <w:kern w:val="0"/>
+          <w:sz w:val="22"/>
+          <w:szCs w:val="22"/>
+        </w:rPr>
+        <w:t xml:space="preserve"> </w:t>
+      </w:r>
+      <w:proofErr w:type="spellStart"/>
+      <w:r>
+        <w:rPr>
+          <w:rFonts w:ascii="Andale Mono" w:hAnsi="Andale Mono" w:cs="Andale Mono"/>
+          <w:color w:val="000000" w:themeColor="text1"/>
+          <w:kern w:val="0"/>
+          <w:sz w:val="22"/>
+          <w:szCs w:val="22"/>
+        </w:rPr>
+        <w:t>phonem</w:t>
+      </w:r>
+      <w:proofErr w:type="spellEnd"/>
+      <w:r>
+        <w:rPr>
+          <w:rFonts w:ascii="Andale Mono" w:hAnsi="Andale Mono" w:cs="Andale Mono"/>
+          <w:color w:val="000000" w:themeColor="text1"/>
+          <w:kern w:val="0"/>
+          <w:sz w:val="22"/>
+          <w:szCs w:val="22"/>
+        </w:rPr>
+        <w:t xml:space="preserve"> positional embeddings</w:t>
+      </w:r>
+    </w:p>
+    <w:p>
+      <w:pPr>
+        <w:pStyle w:val="ListParagraph"/>
+        <w:numPr>
+          <w:ilvl w:val="1"/>
+          <w:numId w:val="3"/>
+        </w:numPr>
+        <w:rPr>
+          <w:rFonts w:ascii="Andale Mono" w:hAnsi="Andale Mono"/>
+          <w:color w:val="000000" w:themeColor="text1"/>
+        </w:rPr>
+      </w:pPr>
+      <w:r>
+        <w:rPr>
+          <w:rFonts w:ascii="Andale Mono" w:hAnsi="Andale Mono" w:cs="Andale Mono"/>
+          <w:color w:val="000000" w:themeColor="text1"/>
+          <w:kern w:val="0"/>
+          <w:sz w:val="22"/>
+          <w:szCs w:val="22"/>
+        </w:rPr>
+        <w:t xml:space="preserve">positions = </w:t>
+      </w:r>
+      <w:proofErr w:type="spellStart"/>
+      <w:proofErr w:type="gramStart"/>
+      <w:r>
+        <w:rPr>
+          <w:rFonts w:ascii="Andale Mono" w:hAnsi="Andale Mono" w:cs="Andale Mono"/>
+          <w:color w:val="000000" w:themeColor="text1"/>
+          <w:kern w:val="0"/>
+          <w:sz w:val="22"/>
+          <w:szCs w:val="22"/>
+        </w:rPr>
+        <w:t>torch.arange</w:t>
+      </w:r>
+      <w:proofErr w:type="spellEnd"/>
+      <w:proofErr w:type="gramEnd"/>
+      <w:r>
+        <w:rPr>
+          <w:rFonts w:ascii="Andale Mono" w:hAnsi="Andale Mono" w:cs="Andale Mono"/>
+          <w:color w:val="000000" w:themeColor="text1"/>
+          <w:kern w:val="0"/>
+          <w:sz w:val="22"/>
+          <w:szCs w:val="22"/>
+        </w:rPr>
+        <w:t xml:space="preserve">(T, device = </w:t>
+      </w:r>
+      <w:proofErr w:type="spellStart"/>
+      <w:r>
+        <w:rPr>
+          <w:rFonts w:ascii="Andale Mono" w:hAnsi="Andale Mono" w:cs="Andale Mono"/>
+          <w:color w:val="000000" w:themeColor="text1"/>
+          <w:kern w:val="0"/>
+          <w:sz w:val="22"/>
+          <w:szCs w:val="22"/>
+        </w:rPr>
+        <w:t>x.device</w:t>
+      </w:r>
+      <w:proofErr w:type="spellEnd"/>
+      <w:r>
+        <w:rPr>
+          <w:rFonts w:ascii="Andale Mono" w:hAnsi="Andale Mono" w:cs="Andale Mono"/>
+          <w:color w:val="000000" w:themeColor="text1"/>
+          <w:kern w:val="0"/>
+          <w:sz w:val="22"/>
+          <w:szCs w:val="22"/>
+        </w:rPr>
+        <w:t>).</w:t>
+      </w:r>
+      <w:proofErr w:type="spellStart"/>
+      <w:r>
+        <w:rPr>
+          <w:rFonts w:ascii="Andale Mono" w:hAnsi="Andale Mono" w:cs="Andale Mono"/>
+          <w:color w:val="000000" w:themeColor="text1"/>
+          <w:kern w:val="0"/>
+          <w:sz w:val="22"/>
+          <w:szCs w:val="22"/>
+        </w:rPr>
+        <w:t>unsqueeze</w:t>
+      </w:r>
+      <w:proofErr w:type="spellEnd"/>
+      <w:r>
+        <w:rPr>
+          <w:rFonts w:ascii="Andale Mono" w:hAnsi="Andale Mono" w:cs="Andale Mono"/>
+          <w:color w:val="000000" w:themeColor="text1"/>
+          <w:kern w:val="0"/>
+          <w:sz w:val="22"/>
+          <w:szCs w:val="22"/>
+        </w:rPr>
+        <w:t>(0).expand(B,T)</w:t>
+      </w:r>
+    </w:p>
+    <w:p>
+      <w:pPr>
+        <w:pStyle w:val="ListParagraph"/>
+        <w:numPr>
+          <w:ilvl w:val="1"/>
+          <w:numId w:val="3"/>
+        </w:numPr>
+        <w:rPr>
+          <w:rFonts w:ascii="Andale Mono" w:hAnsi="Andale Mono"/>
+          <w:color w:val="000000" w:themeColor="text1"/>
+        </w:rPr>
+      </w:pPr>
+      <w:r>
+        <w:rPr>
+          <w:rFonts w:ascii="Andale Mono" w:hAnsi="Andale Mono" w:cs="Andale Mono"/>
+          <w:color w:val="000000" w:themeColor="text1"/>
+          <w:kern w:val="0"/>
+          <w:sz w:val="22"/>
+          <w:szCs w:val="22"/>
+        </w:rPr>
+        <w:t xml:space="preserve">x = x + </w:t>
+      </w:r>
+      <w:proofErr w:type="spellStart"/>
+      <w:proofErr w:type="gramStart"/>
+      <w:r>
+        <w:rPr>
+          <w:rFonts w:ascii="Andale Mono" w:hAnsi="Andale Mono" w:cs="Andale Mono"/>
+          <w:color w:val="000000" w:themeColor="text1"/>
+          <w:kern w:val="0"/>
+          <w:sz w:val="22"/>
+          <w:szCs w:val="22"/>
+        </w:rPr>
+        <w:t>self.phoneme</w:t>
+      </w:r>
+      <w:proofErr w:type="gramEnd"/>
+      <w:r>
+        <w:rPr>
+          <w:rFonts w:ascii="Andale Mono" w:hAnsi="Andale Mono" w:cs="Andale Mono"/>
+          <w:color w:val="000000" w:themeColor="text1"/>
+          <w:kern w:val="0"/>
+          <w:sz w:val="22"/>
+          <w:szCs w:val="22"/>
+        </w:rPr>
+        <w:t>_position_embeddings</w:t>
+      </w:r>
+      <w:proofErr w:type="spellEnd"/>
+      <w:r>
+        <w:rPr>
+          <w:rFonts w:ascii="Andale Mono" w:hAnsi="Andale Mono" w:cs="Andale Mono"/>
+          <w:color w:val="000000" w:themeColor="text1"/>
+          <w:kern w:val="0"/>
+          <w:sz w:val="22"/>
+          <w:szCs w:val="22"/>
+        </w:rPr>
+        <w:t>(positions)</w:t>
+      </w:r>
+    </w:p>
+    <w:p>
+      <w:pPr>
+        <w:pStyle w:val="ListParagraph"/>
+        <w:numPr>
+          <w:ilvl w:val="1"/>
+          <w:numId w:val="3"/>
+        </w:numPr>
+        <w:rPr>
+          <w:rFonts w:ascii="Andale Mono" w:hAnsi="Andale Mono"/>
+          <w:color w:val="000000" w:themeColor="text1"/>
+        </w:rPr>
+      </w:pPr>
+      <w:r>
+        <w:rPr>
+          <w:rFonts w:ascii="Andale Mono" w:hAnsi="Andale Mono" w:cs="Andale Mono"/>
+          <w:color w:val="000000" w:themeColor="text1"/>
+          <w:kern w:val="0"/>
+          <w:sz w:val="22"/>
+          <w:szCs w:val="22"/>
+        </w:rPr>
+        <w:t>can either generate fresh pos embeddings or reuse the ones from before, but the parameter cost might be negligible to generate new ones</w:t>
+      </w:r>
+      <w:r>
+        <w:rPr>
+          <w:rFonts w:ascii="Andale Mono" w:hAnsi="Andale Mono" w:cs="Andale Mono"/>
+          <w:color w:val="000000" w:themeColor="text1"/>
+          <w:kern w:val="0"/>
+          <w:sz w:val="22"/>
+          <w:szCs w:val="22"/>
+        </w:rPr>
+        <w:t xml:space="preserve">, and this might </w:t>
+      </w:r>
     </w:p>
     <w:p>
       <w:pPr>
@@ -671,6 +1233,7 @@
           <w:b/>
           <w:bCs/>
         </w:rPr>
+        <w:lastRenderedPageBreak/>
         <w:t xml:space="preserve">FIXED (04/03) </w:t>
       </w:r>
       <w:r>
@@ -790,18 +1353,7 @@
           <w:sz w:val="22"/>
           <w:szCs w:val="22"/>
         </w:rPr>
-        <w:t xml:space="preserve">Line 1: {'text': 'Anarchism is a political philosophy and movement that is skeptical of all justifications for authority and seeks to abolish the institutions it claims maintain unnecessary coercion and hierarchy, typically including nation-states, and capitalism.', 'ids': [2, 33, 24, 45, 30, 23, 34, 25, 35, 4, 23, 34, 4, 41, 23, 4, 40, 25, 31, 23, 55, 23, 30, 25, 31, 4, 50, 23, 31, 39, 27, 28, 25, 50, 37, 4, 33, 24, 32, 4, 35, 44, 27, 38, 35, 25, 24, 26, 4, 42, 33, 26, 4, 23, </w:t>
-      </w:r>
-      <w:r>
-        <w:rPr>
-          <w:rFonts w:ascii="Andale Mono" w:hAnsi="Andale Mono" w:cs="Andale Mono"/>
-          <w:color w:val="BF4E14" w:themeColor="accent2" w:themeShade="BF"/>
-          <w:kern w:val="0"/>
-          <w:sz w:val="22"/>
-          <w:szCs w:val="22"/>
-        </w:rPr>
-        <w:lastRenderedPageBreak/>
-        <w:t>34, 4, 28, 30, 36, 40, 26, 23, 30, 25, 31, 4, 43, 38, 4, 48, 27, 31, 4, 32, 59, 43, 28, 26, 23, 50, 23, 30, 41, 23, 46, 25, 24, 34, 4, 50, 48, 27, 29, 4, 58, 63, 48, 27, 29, 23, 55, 37, 4, 33, 24, 32, 4, 28, 37, 27, 30, 28, 4, 26, 44, 27, 4, 58, 53, 39, 27, 31, 23, 46, 4, 42, 25, 4, 23, 24, 28, 26, 23, 26, 44, 27, 46, 25, 24, 34, 4, 23, 26, 4, 30, 31, 41, 23, 35, 34, 4, 35, 41, 23, 24, 26, 41, 23, 24, 4, 43, 24, 24, 36, 28, 51, 28, 45, 29, 37, 4, 30, 54, 49, 60, 27, 46, 25, 24, 4, 33, 24, 32, 4, 61, 47, 23, 45, 29, 39, 27, 29, 30, 37, 4, 1, 26, 23, 40, 23, 30, 31, 37, 4, 23, 56, 30, 31, 44, 27, 32, 23, 56, 4, 24, 41, 23, 46, 25, 24, 4, 1, 28, 26, 41, 23, 26, 28, 4, 1, 33, 24, 32, 4, 30, 33, 40, 23, 55, 25, 31, 23, 34, 25, 35, 4, 1, 3]}</w:t>
+        <w:t>Line 1: {'text': 'Anarchism is a political philosophy and movement that is skeptical of all justifications for authority and seeks to abolish the institutions it claims maintain unnecessary coercion and hierarchy, typically including nation-states, and capitalism.', 'ids': [2, 33, 24, 45, 30, 23, 34, 25, 35, 4, 23, 34, 4, 41, 23, 4, 40, 25, 31, 23, 55, 23, 30, 25, 31, 4, 50, 23, 31, 39, 27, 28, 25, 50, 37, 4, 33, 24, 32, 4, 35, 44, 27, 38, 35, 25, 24, 26, 4, 42, 33, 26, 4, 23, 34, 4, 28, 30, 36, 40, 26, 23, 30, 25, 31, 4, 43, 38, 4, 48, 27, 31, 4, 32, 59, 43, 28, 26, 23, 50, 23, 30, 41, 23, 46, 25, 24, 34, 4, 50, 48, 27, 29, 4, 58, 63, 48, 27, 29, 23, 55, 37, 4, 33, 24, 32, 4, 28, 37, 27, 30, 28, 4, 26, 44, 27, 4, 58, 53, 39, 27, 31, 23, 46, 4, 42, 25, 4, 23, 24, 28, 26, 23, 26, 44, 27, 46, 25, 24, 34, 4, 23, 26, 4, 30, 31, 41, 23, 35, 34, 4, 35, 41, 23, 24, 26, 41, 23, 24, 4, 43, 24, 24, 36, 28, 51, 28, 45, 29, 37, 4, 30, 54, 49, 60, 27, 46, 25, 24, 4, 33, 24, 32, 4, 61, 47, 23, 45, 29, 39, 27, 29, 30, 37, 4, 1, 26, 23, 40, 23, 30, 31, 37, 4, 23, 56, 30, 31, 44, 27, 32, 23, 56, 4, 24, 41, 23, 46, 25, 24, 4, 1, 28, 26, 41, 23, 26, 28, 4, 1, 33, 24, 32, 4, 30, 33, 40, 23, 55, 25, 31, 23, 34, 25, 35, 4, 1, 3]}</w:t>
       </w:r>
       <w:r>
         <w:rPr>
@@ -1152,6 +1704,7 @@
           <w:sz w:val="22"/>
           <w:szCs w:val="22"/>
         </w:rPr>
+        <w:lastRenderedPageBreak/>
         <w:t>arch -x86_64 /bin/bash -c "$(curl -</w:t>
       </w:r>
       <w:proofErr w:type="spellStart"/>
@@ -1481,7 +2034,7 @@
           <w:szCs w:val="22"/>
           <w14:ligatures w14:val="none"/>
         </w:rPr>
-        <w:t xml:space="preserve"> install </w:t>
+        <w:t xml:space="preserve"> install -c </w:t>
       </w:r>
       <w:proofErr w:type="spellStart"/>
       <w:r>
@@ -1493,7 +2046,7 @@
           <w:szCs w:val="22"/>
           <w14:ligatures w14:val="none"/>
         </w:rPr>
-        <w:t>-c conda</w:t>
+        <w:t>conda</w:t>
       </w:r>
       <w:proofErr w:type="spellEnd"/>
       <w:r>

</xml_diff>

<commit_message>
update: splitter drafted, needs error fix
</commit_message>
<xml_diff>
--- a/project-overview/todo.docx
+++ b/project-overview/todo.docx
@@ -1110,6 +1110,8 @@
         </w:numPr>
         <w:rPr>
           <w:rFonts w:ascii="Andale Mono" w:hAnsi="Andale Mono"/>
+          <w:b/>
+          <w:bCs/>
           <w:color w:val="000000" w:themeColor="text1"/>
         </w:rPr>
       </w:pPr>
@@ -1131,7 +1133,29 @@
           <w:sz w:val="22"/>
           <w:szCs w:val="22"/>
         </w:rPr>
-        <w:t xml:space="preserve">, and this might </w:t>
+        <w:t>, and this might</w:t>
+      </w:r>
+      <w:r>
+        <w:rPr>
+          <w:rFonts w:ascii="Andale Mono" w:hAnsi="Andale Mono" w:cs="Andale Mono"/>
+          <w:color w:val="000000" w:themeColor="text1"/>
+          <w:kern w:val="0"/>
+          <w:sz w:val="22"/>
+          <w:szCs w:val="22"/>
+        </w:rPr>
+        <w:t xml:space="preserve"> make the outputs higher quality?? </w:t>
+      </w:r>
+      <w:r>
+        <w:rPr>
+          <w:rFonts w:ascii="Andale Mono" w:hAnsi="Andale Mono" w:cs="Andale Mono"/>
+          <w:b/>
+          <w:bCs/>
+          <w:color w:val="000000" w:themeColor="text1"/>
+          <w:kern w:val="0"/>
+          <w:sz w:val="22"/>
+          <w:szCs w:val="22"/>
+        </w:rPr>
+        <w:t>Big question mark here.</w:t>
       </w:r>
     </w:p>
     <w:p>

</xml_diff>

<commit_message>
update: to the overview doc
</commit_message>
<xml_diff>
--- a/project-overview/todo.docx
+++ b/project-overview/todo.docx
@@ -1,6 +1,6 @@
 
 <file path=word/document.xml><?xml version="1.0" encoding="utf-8"?>
-<w:document xmlns:wpc="http://schemas.microsoft.com/office/word/2010/wordprocessingCanvas" xmlns:cx="http://schemas.microsoft.com/office/drawing/2014/chartex" xmlns:cx1="http://schemas.microsoft.com/office/drawing/2015/9/8/chartex" xmlns:cx2="http://schemas.microsoft.com/office/drawing/2015/10/21/chartex" xmlns:cx3="http://schemas.microsoft.com/office/drawing/2016/5/9/chartex" xmlns:cx4="http://schemas.microsoft.com/office/drawing/2016/5/10/chartex" xmlns:cx5="http://schemas.microsoft.com/office/drawing/2016/5/11/chartex" xmlns:cx6="http://schemas.microsoft.com/office/drawing/2016/5/12/chartex" xmlns:cx7="http://schemas.microsoft.com/office/drawing/2016/5/13/chartex" xmlns:cx8="http://schemas.microsoft.com/office/drawing/2016/5/14/chartex" xmlns:mc="http://schemas.openxmlformats.org/markup-compatibility/2006" xmlns:aink="http://schemas.microsoft.com/office/drawing/2016/ink" xmlns:am3d="http://schemas.microsoft.com/office/drawing/2017/model3d" xmlns:o="urn:schemas-microsoft-com:office:office" xmlns:oel="http://schemas.microsoft.com/office/2019/extlst" xmlns:r="http://schemas.openxmlformats.org/officeDocument/2006/relationships" xmlns:m="http://schemas.openxmlformats.org/officeDocument/2006/math" xmlns:v="urn:schemas-microsoft-com:vml" xmlns:wp14="http://schemas.microsoft.com/office/word/2010/wordprocessingDrawing" xmlns:wp="http://schemas.openxmlformats.org/drawingml/2006/wordprocessingDrawing" xmlns:w10="urn:schemas-microsoft-com:office:word" xmlns:w="http://schemas.openxmlformats.org/wordprocessingml/2006/main" xmlns:w14="http://schemas.microsoft.com/office/word/2010/wordml" xmlns:w15="http://schemas.microsoft.com/office/word/2012/wordml" xmlns:w16cex="http://schemas.microsoft.com/office/word/2018/wordml/cex" xmlns:w16cid="http://schemas.microsoft.com/office/word/2016/wordml/cid" xmlns:w16="http://schemas.microsoft.com/office/word/2018/wordml" xmlns:w16sdtdh="http://schemas.microsoft.com/office/word/2020/wordml/sdtdatahash" xmlns:w16se="http://schemas.microsoft.com/office/word/2015/wordml/symex" xmlns:wpg="http://schemas.microsoft.com/office/word/2010/wordprocessingGroup" xmlns:wpi="http://schemas.microsoft.com/office/word/2010/wordprocessingInk" xmlns:wne="http://schemas.microsoft.com/office/word/2006/wordml" xmlns:wps="http://schemas.microsoft.com/office/word/2010/wordprocessingShape" mc:Ignorable="w14 w15 w16se w16cid w16 w16cex w16sdtdh wp14">
+<w:document xmlns:wpc="http://schemas.microsoft.com/office/word/2010/wordprocessingCanvas" xmlns:cx="http://schemas.microsoft.com/office/drawing/2014/chartex" xmlns:cx1="http://schemas.microsoft.com/office/drawing/2015/9/8/chartex" xmlns:cx2="http://schemas.microsoft.com/office/drawing/2015/10/21/chartex" xmlns:cx3="http://schemas.microsoft.com/office/drawing/2016/5/9/chartex" xmlns:cx4="http://schemas.microsoft.com/office/drawing/2016/5/10/chartex" xmlns:cx5="http://schemas.microsoft.com/office/drawing/2016/5/11/chartex" xmlns:cx6="http://schemas.microsoft.com/office/drawing/2016/5/12/chartex" xmlns:cx7="http://schemas.microsoft.com/office/drawing/2016/5/13/chartex" xmlns:cx8="http://schemas.microsoft.com/office/drawing/2016/5/14/chartex" xmlns:mc="http://schemas.openxmlformats.org/markup-compatibility/2006" xmlns:aink="http://schemas.microsoft.com/office/drawing/2016/ink" xmlns:am3d="http://schemas.microsoft.com/office/drawing/2017/model3d" xmlns:o="urn:schemas-microsoft-com:office:office" xmlns:oel="http://schemas.microsoft.com/office/2019/extlst" xmlns:r="http://schemas.openxmlformats.org/officeDocument/2006/relationships" xmlns:m="http://schemas.openxmlformats.org/officeDocument/2006/math" xmlns:v="urn:schemas-microsoft-com:vml" xmlns:wp14="http://schemas.microsoft.com/office/word/2010/wordprocessingDrawing" xmlns:wp="http://schemas.openxmlformats.org/drawingml/2006/wordprocessingDrawing" xmlns:w10="urn:schemas-microsoft-com:office:word" xmlns:w="http://schemas.openxmlformats.org/wordprocessingml/2006/main" xmlns:w14="http://schemas.microsoft.com/office/word/2010/wordml" xmlns:w15="http://schemas.microsoft.com/office/word/2012/wordml" xmlns:w16cex="http://schemas.microsoft.com/office/word/2018/wordml/cex" xmlns:w16cid="http://schemas.microsoft.com/office/word/2016/wordml/cid" xmlns:w16="http://schemas.microsoft.com/office/word/2018/wordml" xmlns:w16du="http://schemas.microsoft.com/office/word/2023/wordml/word16du" xmlns:w16sdtdh="http://schemas.microsoft.com/office/word/2020/wordml/sdtdatahash" xmlns:w16sdtfl="http://schemas.microsoft.com/office/word/2024/wordml/sdtformatlock" xmlns:w16se="http://schemas.microsoft.com/office/word/2015/wordml/symex" xmlns:wpg="http://schemas.microsoft.com/office/word/2010/wordprocessingGroup" xmlns:wpi="http://schemas.microsoft.com/office/word/2010/wordprocessingInk" xmlns:wne="http://schemas.microsoft.com/office/word/2006/wordml" xmlns:wps="http://schemas.microsoft.com/office/word/2010/wordprocessingShape" mc:Ignorable="w14 w15 w16se w16cid w16 w16cex w16sdtdh w16sdtfl w16du wp14">
   <w:body>
     <w:p>
       <w:pPr>
@@ -444,12 +444,52 @@
         <w:t>text,language</w:t>
       </w:r>
       <w:proofErr w:type="spellEnd"/>
+      <w:r>
+        <w:rPr>
+          <w:rFonts w:ascii="Andale Mono" w:hAnsi="Andale Mono"/>
+          <w:color w:val="000000" w:themeColor="text1"/>
+        </w:rPr>
+        <w:t>=”</w:t>
+      </w:r>
+      <w:proofErr w:type="spellStart"/>
+      <w:r>
+        <w:rPr>
+          <w:rFonts w:ascii="Andale Mono" w:hAnsi="Andale Mono"/>
+          <w:color w:val="000000" w:themeColor="text1"/>
+        </w:rPr>
+        <w:t>en</w:t>
+      </w:r>
+      <w:proofErr w:type="spellEnd"/>
       <w:proofErr w:type="gramEnd"/>
       <w:r>
         <w:rPr>
           <w:rFonts w:ascii="Andale Mono" w:hAnsi="Andale Mono"/>
           <w:color w:val="000000" w:themeColor="text1"/>
         </w:rPr>
+        <w:t>-</w:t>
+      </w:r>
+      <w:proofErr w:type="spellStart"/>
+      <w:r>
+        <w:rPr>
+          <w:rFonts w:ascii="Andale Mono" w:hAnsi="Andale Mono"/>
+          <w:color w:val="000000" w:themeColor="text1"/>
+        </w:rPr>
+        <w:t>us</w:t>
+      </w:r>
+      <w:proofErr w:type="gramStart"/>
+      <w:r>
+        <w:rPr>
+          <w:rFonts w:ascii="Andale Mono" w:hAnsi="Andale Mono"/>
+          <w:color w:val="000000" w:themeColor="text1"/>
+        </w:rPr>
+        <w:t>”,backend</w:t>
+      </w:r>
+      <w:proofErr w:type="spellEnd"/>
+      <w:r>
+        <w:rPr>
+          <w:rFonts w:ascii="Andale Mono" w:hAnsi="Andale Mono"/>
+          <w:color w:val="000000" w:themeColor="text1"/>
+        </w:rPr>
         <w:t>=”</w:t>
       </w:r>
       <w:proofErr w:type="spellStart"/>
@@ -458,41 +498,10 @@
           <w:rFonts w:ascii="Andale Mono" w:hAnsi="Andale Mono"/>
           <w:color w:val="000000" w:themeColor="text1"/>
         </w:rPr>
-        <w:t>en</w:t>
-      </w:r>
-      <w:proofErr w:type="spellEnd"/>
-      <w:r>
-        <w:rPr>
-          <w:rFonts w:ascii="Andale Mono" w:hAnsi="Andale Mono"/>
-          <w:color w:val="000000" w:themeColor="text1"/>
-        </w:rPr>
-        <w:t>-</w:t>
-      </w:r>
-      <w:proofErr w:type="spellStart"/>
-      <w:r>
-        <w:rPr>
-          <w:rFonts w:ascii="Andale Mono" w:hAnsi="Andale Mono"/>
-          <w:color w:val="000000" w:themeColor="text1"/>
-        </w:rPr>
-        <w:t>us”,backend</w:t>
-      </w:r>
-      <w:proofErr w:type="spellEnd"/>
-      <w:r>
-        <w:rPr>
-          <w:rFonts w:ascii="Andale Mono" w:hAnsi="Andale Mono"/>
-          <w:color w:val="000000" w:themeColor="text1"/>
-        </w:rPr>
-        <w:t>=”</w:t>
-      </w:r>
-      <w:proofErr w:type="spellStart"/>
-      <w:r>
-        <w:rPr>
-          <w:rFonts w:ascii="Andale Mono" w:hAnsi="Andale Mono"/>
-          <w:color w:val="000000" w:themeColor="text1"/>
-        </w:rPr>
         <w:t>espeak</w:t>
       </w:r>
       <w:proofErr w:type="spellEnd"/>
+      <w:proofErr w:type="gramEnd"/>
       <w:r>
         <w:rPr>
           <w:rFonts w:ascii="Andale Mono" w:hAnsi="Andale Mono"/>
@@ -540,19 +549,37 @@
         </w:numPr>
         <w:rPr>
           <w:rFonts w:ascii="Andale Mono" w:hAnsi="Andale Mono"/>
-          <w:color w:val="000000" w:themeColor="text1"/>
-        </w:rPr>
-      </w:pPr>
-      <w:r>
-        <w:rPr>
-          <w:rFonts w:ascii="Andale Mono" w:hAnsi="Andale Mono" w:cs="Andale Mono"/>
-          <w:color w:val="000000" w:themeColor="text1"/>
-          <w:kern w:val="0"/>
-          <w:sz w:val="22"/>
-          <w:szCs w:val="22"/>
-        </w:rPr>
-        <w:t>(03/27) DRAFTING the model.py file</w:t>
-      </w:r>
+        </w:rPr>
+      </w:pPr>
+      <w:r>
+        <w:rPr>
+          <w:rFonts w:ascii="Andale Mono" w:hAnsi="Andale Mono"/>
+        </w:rPr>
+        <w:t xml:space="preserve">(06/25) TESTING </w:t>
+      </w:r>
+      <w:proofErr w:type="spellStart"/>
+      <w:r>
+        <w:rPr>
+          <w:rFonts w:ascii="Andale Mono" w:hAnsi="Andale Mono"/>
+        </w:rPr>
+        <w:t>phonLM</w:t>
+      </w:r>
+      <w:proofErr w:type="spellEnd"/>
+      <w:r>
+        <w:rPr>
+          <w:rFonts w:ascii="Andale Mono" w:hAnsi="Andale Mono"/>
+        </w:rPr>
+        <w:t xml:space="preserve"> ran on the school Mac, now going to check how its various checkpoints do when computing the summed probability of phonological sequences for English words and nonwords, from the Auditory English Lexicon Project: </w:t>
+      </w:r>
+      <w:hyperlink r:id="rId5" w:history="1">
+        <w:r>
+          <w:rPr>
+            <w:rStyle w:val="Hyperlink"/>
+            <w:rFonts w:ascii="Andale Mono" w:hAnsi="Andale Mono"/>
+          </w:rPr>
+          <w:t>https://inetapps.nus.edu.sg/aelp/generate</w:t>
+        </w:r>
+      </w:hyperlink>
     </w:p>
     <w:p>
       <w:pPr>
@@ -574,6 +601,29 @@
           <w:sz w:val="22"/>
           <w:szCs w:val="22"/>
         </w:rPr>
+        <w:t>(03/27) DRAFTING the model.py file</w:t>
+      </w:r>
+    </w:p>
+    <w:p>
+      <w:pPr>
+        <w:pStyle w:val="ListParagraph"/>
+        <w:numPr>
+          <w:ilvl w:val="0"/>
+          <w:numId w:val="3"/>
+        </w:numPr>
+        <w:rPr>
+          <w:rFonts w:ascii="Andale Mono" w:hAnsi="Andale Mono"/>
+          <w:color w:val="000000" w:themeColor="text1"/>
+        </w:rPr>
+      </w:pPr>
+      <w:r>
+        <w:rPr>
+          <w:rFonts w:ascii="Andale Mono" w:hAnsi="Andale Mono" w:cs="Andale Mono"/>
+          <w:color w:val="000000" w:themeColor="text1"/>
+          <w:kern w:val="0"/>
+          <w:sz w:val="22"/>
+          <w:szCs w:val="22"/>
+        </w:rPr>
         <w:t xml:space="preserve">(04/21) DRAFTING the </w:t>
       </w:r>
       <w:proofErr w:type="spellStart"/>
@@ -1000,6 +1050,7 @@
         <w:t xml:space="preserve">(T, device = </w:t>
       </w:r>
       <w:proofErr w:type="spellStart"/>
+      <w:proofErr w:type="gramStart"/>
       <w:r>
         <w:rPr>
           <w:rFonts w:ascii="Andale Mono" w:hAnsi="Andale Mono" w:cs="Andale Mono"/>
@@ -1033,15 +1084,60 @@
         <w:t>unsqueeze</w:t>
       </w:r>
       <w:proofErr w:type="spellEnd"/>
-      <w:r>
-        <w:rPr>
-          <w:rFonts w:ascii="Andale Mono" w:hAnsi="Andale Mono" w:cs="Andale Mono"/>
-          <w:color w:val="000000" w:themeColor="text1"/>
-          <w:kern w:val="0"/>
-          <w:sz w:val="22"/>
-          <w:szCs w:val="22"/>
-        </w:rPr>
-        <w:t>(0).expand(B,T)</w:t>
+      <w:proofErr w:type="gramEnd"/>
+      <w:r>
+        <w:rPr>
+          <w:rFonts w:ascii="Andale Mono" w:hAnsi="Andale Mono" w:cs="Andale Mono"/>
+          <w:color w:val="000000" w:themeColor="text1"/>
+          <w:kern w:val="0"/>
+          <w:sz w:val="22"/>
+          <w:szCs w:val="22"/>
+        </w:rPr>
+        <w:t>(0</w:t>
+      </w:r>
+      <w:proofErr w:type="gramStart"/>
+      <w:r>
+        <w:rPr>
+          <w:rFonts w:ascii="Andale Mono" w:hAnsi="Andale Mono" w:cs="Andale Mono"/>
+          <w:color w:val="000000" w:themeColor="text1"/>
+          <w:kern w:val="0"/>
+          <w:sz w:val="22"/>
+          <w:szCs w:val="22"/>
+        </w:rPr>
+        <w:t>).expand</w:t>
+      </w:r>
+      <w:proofErr w:type="gramEnd"/>
+      <w:r>
+        <w:rPr>
+          <w:rFonts w:ascii="Andale Mono" w:hAnsi="Andale Mono" w:cs="Andale Mono"/>
+          <w:color w:val="000000" w:themeColor="text1"/>
+          <w:kern w:val="0"/>
+          <w:sz w:val="22"/>
+          <w:szCs w:val="22"/>
+        </w:rPr>
+        <w:t>(</w:t>
+      </w:r>
+      <w:proofErr w:type="gramStart"/>
+      <w:r>
+        <w:rPr>
+          <w:rFonts w:ascii="Andale Mono" w:hAnsi="Andale Mono" w:cs="Andale Mono"/>
+          <w:color w:val="000000" w:themeColor="text1"/>
+          <w:kern w:val="0"/>
+          <w:sz w:val="22"/>
+          <w:szCs w:val="22"/>
+        </w:rPr>
+        <w:t>B,T</w:t>
+      </w:r>
+      <w:proofErr w:type="gramEnd"/>
+      <w:r>
+        <w:rPr>
+          <w:rFonts w:ascii="Andale Mono" w:hAnsi="Andale Mono" w:cs="Andale Mono"/>
+          <w:color w:val="000000" w:themeColor="text1"/>
+          <w:kern w:val="0"/>
+          <w:sz w:val="22"/>
+          <w:szCs w:val="22"/>
+        </w:rPr>
+        <w:t>)</w:t>
       </w:r>
     </w:p>
     <w:p>
@@ -1168,6 +1264,7 @@
         <w:rPr>
           <w:rFonts w:ascii="Andale Mono" w:hAnsi="Andale Mono"/>
         </w:rPr>
+        <w:lastRenderedPageBreak/>
         <w:t>DONE:</w:t>
       </w:r>
     </w:p>
@@ -1257,7 +1354,6 @@
           <w:b/>
           <w:bCs/>
         </w:rPr>
-        <w:lastRenderedPageBreak/>
         <w:t xml:space="preserve">FIXED (04/03) </w:t>
       </w:r>
       <w:r>
@@ -1615,6 +1711,7 @@
           <w:b/>
           <w:bCs/>
         </w:rPr>
+        <w:lastRenderedPageBreak/>
         <w:t>INSTALL</w:t>
       </w:r>
       <w:r>
@@ -1728,7 +1825,6 @@
           <w:sz w:val="22"/>
           <w:szCs w:val="22"/>
         </w:rPr>
-        <w:lastRenderedPageBreak/>
         <w:t>arch -x86_64 /bin/bash -c "$(curl -</w:t>
       </w:r>
       <w:proofErr w:type="spellStart"/>
@@ -2327,7 +2423,7 @@
 </file>
 
 <file path=word/comments.xml><?xml version="1.0" encoding="utf-8"?>
-<w:comments xmlns:wpc="http://schemas.microsoft.com/office/word/2010/wordprocessingCanvas" xmlns:cx="http://schemas.microsoft.com/office/drawing/2014/chartex" xmlns:cx1="http://schemas.microsoft.com/office/drawing/2015/9/8/chartex" xmlns:cx2="http://schemas.microsoft.com/office/drawing/2015/10/21/chartex" xmlns:cx3="http://schemas.microsoft.com/office/drawing/2016/5/9/chartex" xmlns:cx4="http://schemas.microsoft.com/office/drawing/2016/5/10/chartex" xmlns:cx5="http://schemas.microsoft.com/office/drawing/2016/5/11/chartex" xmlns:cx6="http://schemas.microsoft.com/office/drawing/2016/5/12/chartex" xmlns:cx7="http://schemas.microsoft.com/office/drawing/2016/5/13/chartex" xmlns:cx8="http://schemas.microsoft.com/office/drawing/2016/5/14/chartex" xmlns:mc="http://schemas.openxmlformats.org/markup-compatibility/2006" xmlns:aink="http://schemas.microsoft.com/office/drawing/2016/ink" xmlns:am3d="http://schemas.microsoft.com/office/drawing/2017/model3d" xmlns:o="urn:schemas-microsoft-com:office:office" xmlns:oel="http://schemas.microsoft.com/office/2019/extlst" xmlns:r="http://schemas.openxmlformats.org/officeDocument/2006/relationships" xmlns:m="http://schemas.openxmlformats.org/officeDocument/2006/math" xmlns:v="urn:schemas-microsoft-com:vml" xmlns:wp14="http://schemas.microsoft.com/office/word/2010/wordprocessingDrawing" xmlns:wp="http://schemas.openxmlformats.org/drawingml/2006/wordprocessingDrawing" xmlns:w10="urn:schemas-microsoft-com:office:word" xmlns:w="http://schemas.openxmlformats.org/wordprocessingml/2006/main" xmlns:w14="http://schemas.microsoft.com/office/word/2010/wordml" xmlns:w15="http://schemas.microsoft.com/office/word/2012/wordml" xmlns:w16cex="http://schemas.microsoft.com/office/word/2018/wordml/cex" xmlns:w16cid="http://schemas.microsoft.com/office/word/2016/wordml/cid" xmlns:w16="http://schemas.microsoft.com/office/word/2018/wordml" xmlns:w16sdtdh="http://schemas.microsoft.com/office/word/2020/wordml/sdtdatahash" xmlns:w16se="http://schemas.microsoft.com/office/word/2015/wordml/symex" xmlns:wpg="http://schemas.microsoft.com/office/word/2010/wordprocessingGroup" xmlns:wpi="http://schemas.microsoft.com/office/word/2010/wordprocessingInk" xmlns:wne="http://schemas.microsoft.com/office/word/2006/wordml" xmlns:wps="http://schemas.microsoft.com/office/word/2010/wordprocessingShape" mc:Ignorable="w14 w15 w16se w16cid w16 w16cex w16sdtdh wp14">
+<w:comments xmlns:wpc="http://schemas.microsoft.com/office/word/2010/wordprocessingCanvas" xmlns:cx="http://schemas.microsoft.com/office/drawing/2014/chartex" xmlns:cx1="http://schemas.microsoft.com/office/drawing/2015/9/8/chartex" xmlns:cx2="http://schemas.microsoft.com/office/drawing/2015/10/21/chartex" xmlns:cx3="http://schemas.microsoft.com/office/drawing/2016/5/9/chartex" xmlns:cx4="http://schemas.microsoft.com/office/drawing/2016/5/10/chartex" xmlns:cx5="http://schemas.microsoft.com/office/drawing/2016/5/11/chartex" xmlns:cx6="http://schemas.microsoft.com/office/drawing/2016/5/12/chartex" xmlns:cx7="http://schemas.microsoft.com/office/drawing/2016/5/13/chartex" xmlns:cx8="http://schemas.microsoft.com/office/drawing/2016/5/14/chartex" xmlns:mc="http://schemas.openxmlformats.org/markup-compatibility/2006" xmlns:aink="http://schemas.microsoft.com/office/drawing/2016/ink" xmlns:am3d="http://schemas.microsoft.com/office/drawing/2017/model3d" xmlns:o="urn:schemas-microsoft-com:office:office" xmlns:oel="http://schemas.microsoft.com/office/2019/extlst" xmlns:r="http://schemas.openxmlformats.org/officeDocument/2006/relationships" xmlns:m="http://schemas.openxmlformats.org/officeDocument/2006/math" xmlns:v="urn:schemas-microsoft-com:vml" xmlns:wp14="http://schemas.microsoft.com/office/word/2010/wordprocessingDrawing" xmlns:wp="http://schemas.openxmlformats.org/drawingml/2006/wordprocessingDrawing" xmlns:w10="urn:schemas-microsoft-com:office:word" xmlns:w="http://schemas.openxmlformats.org/wordprocessingml/2006/main" xmlns:w14="http://schemas.microsoft.com/office/word/2010/wordml" xmlns:w15="http://schemas.microsoft.com/office/word/2012/wordml" xmlns:w16cex="http://schemas.microsoft.com/office/word/2018/wordml/cex" xmlns:w16cid="http://schemas.microsoft.com/office/word/2016/wordml/cid" xmlns:w16="http://schemas.microsoft.com/office/word/2018/wordml" xmlns:w16du="http://schemas.microsoft.com/office/word/2023/wordml/word16du" xmlns:w16sdtdh="http://schemas.microsoft.com/office/word/2020/wordml/sdtdatahash" xmlns:w16sdtfl="http://schemas.microsoft.com/office/word/2024/wordml/sdtformatlock" xmlns:w16se="http://schemas.microsoft.com/office/word/2015/wordml/symex" xmlns:wpg="http://schemas.microsoft.com/office/word/2010/wordprocessingGroup" xmlns:wpi="http://schemas.microsoft.com/office/word/2010/wordprocessingInk" xmlns:wne="http://schemas.microsoft.com/office/word/2006/wordml" xmlns:wps="http://schemas.microsoft.com/office/word/2010/wordprocessingShape" mc:Ignorable="w14 w15 w16se w16cid w16 w16cex w16sdtdh w16sdtfl w16du wp14">
   <w:comment w:id="1" w:author="Pamela D Riviere" w:date="2026-02-27T11:56:00Z" w:initials="PDR">
     <w:p>
       <w:r>
@@ -2341,23 +2437,7 @@
           <w:sz w:val="20"/>
           <w:szCs w:val="20"/>
         </w:rPr>
-        <w:t xml:space="preserve">you can run &gt;&gt; </w:t>
-      </w:r>
-      <w:proofErr w:type="spellStart"/>
-      <w:r>
-        <w:rPr>
-          <w:sz w:val="20"/>
-          <w:szCs w:val="20"/>
-        </w:rPr>
-        <w:t>uname</w:t>
-      </w:r>
-      <w:proofErr w:type="spellEnd"/>
-      <w:r>
-        <w:rPr>
-          <w:sz w:val="20"/>
-          <w:szCs w:val="20"/>
-        </w:rPr>
-        <w:t xml:space="preserve"> -m in bash shell to figure out your device's architecture</w:t>
+        <w:t>you can run &gt;&gt; uname -m in bash shell to figure out your device's architecture</w:t>
       </w:r>
     </w:p>
   </w:comment>
@@ -2374,23 +2454,7 @@
           <w:sz w:val="20"/>
           <w:szCs w:val="20"/>
         </w:rPr>
-        <w:t xml:space="preserve">to check Anaconda distribution: &gt;&gt; </w:t>
-      </w:r>
-      <w:proofErr w:type="spellStart"/>
-      <w:r>
-        <w:rPr>
-          <w:sz w:val="20"/>
-          <w:szCs w:val="20"/>
-        </w:rPr>
-        <w:t>conda</w:t>
-      </w:r>
-      <w:proofErr w:type="spellEnd"/>
-      <w:r>
-        <w:rPr>
-          <w:sz w:val="20"/>
-          <w:szCs w:val="20"/>
-        </w:rPr>
-        <w:t xml:space="preserve"> info</w:t>
+        <w:t>to check Anaconda distribution: &gt;&gt; conda info</w:t>
       </w:r>
     </w:p>
     <w:p/>
@@ -2417,7 +2481,7 @@
 </file>
 
 <file path=word/commentsExtended.xml><?xml version="1.0" encoding="utf-8"?>
-<w15:commentsEx xmlns:wpc="http://schemas.microsoft.com/office/word/2010/wordprocessingCanvas" xmlns:cx="http://schemas.microsoft.com/office/drawing/2014/chartex" xmlns:cx1="http://schemas.microsoft.com/office/drawing/2015/9/8/chartex" xmlns:cx2="http://schemas.microsoft.com/office/drawing/2015/10/21/chartex" xmlns:cx3="http://schemas.microsoft.com/office/drawing/2016/5/9/chartex" xmlns:cx4="http://schemas.microsoft.com/office/drawing/2016/5/10/chartex" xmlns:cx5="http://schemas.microsoft.com/office/drawing/2016/5/11/chartex" xmlns:cx6="http://schemas.microsoft.com/office/drawing/2016/5/12/chartex" xmlns:cx7="http://schemas.microsoft.com/office/drawing/2016/5/13/chartex" xmlns:cx8="http://schemas.microsoft.com/office/drawing/2016/5/14/chartex" xmlns:mc="http://schemas.openxmlformats.org/markup-compatibility/2006" xmlns:aink="http://schemas.microsoft.com/office/drawing/2016/ink" xmlns:am3d="http://schemas.microsoft.com/office/drawing/2017/model3d" xmlns:o="urn:schemas-microsoft-com:office:office" xmlns:oel="http://schemas.microsoft.com/office/2019/extlst" xmlns:r="http://schemas.openxmlformats.org/officeDocument/2006/relationships" xmlns:m="http://schemas.openxmlformats.org/officeDocument/2006/math" xmlns:v="urn:schemas-microsoft-com:vml" xmlns:wp14="http://schemas.microsoft.com/office/word/2010/wordprocessingDrawing" xmlns:wp="http://schemas.openxmlformats.org/drawingml/2006/wordprocessingDrawing" xmlns:w10="urn:schemas-microsoft-com:office:word" xmlns:w="http://schemas.openxmlformats.org/wordprocessingml/2006/main" xmlns:w14="http://schemas.microsoft.com/office/word/2010/wordml" xmlns:w15="http://schemas.microsoft.com/office/word/2012/wordml" xmlns:w16cex="http://schemas.microsoft.com/office/word/2018/wordml/cex" xmlns:w16cid="http://schemas.microsoft.com/office/word/2016/wordml/cid" xmlns:w16="http://schemas.microsoft.com/office/word/2018/wordml" xmlns:w16sdtdh="http://schemas.microsoft.com/office/word/2020/wordml/sdtdatahash" xmlns:w16se="http://schemas.microsoft.com/office/word/2015/wordml/symex" xmlns:wpg="http://schemas.microsoft.com/office/word/2010/wordprocessingGroup" xmlns:wpi="http://schemas.microsoft.com/office/word/2010/wordprocessingInk" xmlns:wne="http://schemas.microsoft.com/office/word/2006/wordml" xmlns:wps="http://schemas.microsoft.com/office/word/2010/wordprocessingShape" mc:Ignorable="w14 w15 w16se w16cid w16 w16cex w16sdtdh wp14">
+<w15:commentsEx xmlns:wpc="http://schemas.microsoft.com/office/word/2010/wordprocessingCanvas" xmlns:cx="http://schemas.microsoft.com/office/drawing/2014/chartex" xmlns:cx1="http://schemas.microsoft.com/office/drawing/2015/9/8/chartex" xmlns:cx2="http://schemas.microsoft.com/office/drawing/2015/10/21/chartex" xmlns:cx3="http://schemas.microsoft.com/office/drawing/2016/5/9/chartex" xmlns:cx4="http://schemas.microsoft.com/office/drawing/2016/5/10/chartex" xmlns:cx5="http://schemas.microsoft.com/office/drawing/2016/5/11/chartex" xmlns:cx6="http://schemas.microsoft.com/office/drawing/2016/5/12/chartex" xmlns:cx7="http://schemas.microsoft.com/office/drawing/2016/5/13/chartex" xmlns:cx8="http://schemas.microsoft.com/office/drawing/2016/5/14/chartex" xmlns:mc="http://schemas.openxmlformats.org/markup-compatibility/2006" xmlns:aink="http://schemas.microsoft.com/office/drawing/2016/ink" xmlns:am3d="http://schemas.microsoft.com/office/drawing/2017/model3d" xmlns:o="urn:schemas-microsoft-com:office:office" xmlns:oel="http://schemas.microsoft.com/office/2019/extlst" xmlns:r="http://schemas.openxmlformats.org/officeDocument/2006/relationships" xmlns:m="http://schemas.openxmlformats.org/officeDocument/2006/math" xmlns:v="urn:schemas-microsoft-com:vml" xmlns:wp14="http://schemas.microsoft.com/office/word/2010/wordprocessingDrawing" xmlns:wp="http://schemas.openxmlformats.org/drawingml/2006/wordprocessingDrawing" xmlns:w10="urn:schemas-microsoft-com:office:word" xmlns:w="http://schemas.openxmlformats.org/wordprocessingml/2006/main" xmlns:w14="http://schemas.microsoft.com/office/word/2010/wordml" xmlns:w15="http://schemas.microsoft.com/office/word/2012/wordml" xmlns:w16cex="http://schemas.microsoft.com/office/word/2018/wordml/cex" xmlns:w16cid="http://schemas.microsoft.com/office/word/2016/wordml/cid" xmlns:w16="http://schemas.microsoft.com/office/word/2018/wordml" xmlns:w16du="http://schemas.microsoft.com/office/word/2023/wordml/word16du" xmlns:w16sdtdh="http://schemas.microsoft.com/office/word/2020/wordml/sdtdatahash" xmlns:w16sdtfl="http://schemas.microsoft.com/office/word/2024/wordml/sdtformatlock" xmlns:w16se="http://schemas.microsoft.com/office/word/2015/wordml/symex" xmlns:wpg="http://schemas.microsoft.com/office/word/2010/wordprocessingGroup" xmlns:wpi="http://schemas.microsoft.com/office/word/2010/wordprocessingInk" xmlns:wne="http://schemas.microsoft.com/office/word/2006/wordml" xmlns:wps="http://schemas.microsoft.com/office/word/2010/wordprocessingShape" mc:Ignorable="w14 w15 w16se w16cid w16 w16cex w16sdtdh w16sdtfl w16du wp14">
   <w15:commentEx w15:paraId="3817DCA9" w15:done="0"/>
   <w15:commentEx w15:paraId="69FE89AA" w15:paraIdParent="3817DCA9" w15:done="0"/>
   <w15:commentEx w15:paraId="544ACBE9" w15:paraIdParent="3817DCA9" w15:done="0"/>
@@ -2425,7 +2489,7 @@
 </file>
 
 <file path=word/commentsExtensible.xml><?xml version="1.0" encoding="utf-8"?>
-<w16cex:commentsExtensible xmlns:wpc="http://schemas.microsoft.com/office/word/2010/wordprocessingCanvas" xmlns:cx="http://schemas.microsoft.com/office/drawing/2014/chartex" xmlns:cx1="http://schemas.microsoft.com/office/drawing/2015/9/8/chartex" xmlns:cx2="http://schemas.microsoft.com/office/drawing/2015/10/21/chartex" xmlns:cx3="http://schemas.microsoft.com/office/drawing/2016/5/9/chartex" xmlns:cx4="http://schemas.microsoft.com/office/drawing/2016/5/10/chartex" xmlns:cx5="http://schemas.microsoft.com/office/drawing/2016/5/11/chartex" xmlns:cx6="http://schemas.microsoft.com/office/drawing/2016/5/12/chartex" xmlns:cx7="http://schemas.microsoft.com/office/drawing/2016/5/13/chartex" xmlns:cx8="http://schemas.microsoft.com/office/drawing/2016/5/14/chartex" xmlns:mc="http://schemas.openxmlformats.org/markup-compatibility/2006" xmlns:aink="http://schemas.microsoft.com/office/drawing/2016/ink" xmlns:am3d="http://schemas.microsoft.com/office/drawing/2017/model3d" xmlns:o="urn:schemas-microsoft-com:office:office" xmlns:oel="http://schemas.microsoft.com/office/2019/extlst" xmlns:r="http://schemas.openxmlformats.org/officeDocument/2006/relationships" xmlns:m="http://schemas.openxmlformats.org/officeDocument/2006/math" xmlns:v="urn:schemas-microsoft-com:vml" xmlns:wp14="http://schemas.microsoft.com/office/word/2010/wordprocessingDrawing" xmlns:wp="http://schemas.openxmlformats.org/drawingml/2006/wordprocessingDrawing" xmlns:w10="urn:schemas-microsoft-com:office:word" xmlns:w="http://schemas.openxmlformats.org/wordprocessingml/2006/main" xmlns:w14="http://schemas.microsoft.com/office/word/2010/wordml" xmlns:w15="http://schemas.microsoft.com/office/word/2012/wordml" xmlns:w16cex="http://schemas.microsoft.com/office/word/2018/wordml/cex" xmlns:w16cid="http://schemas.microsoft.com/office/word/2016/wordml/cid" xmlns:w16="http://schemas.microsoft.com/office/word/2018/wordml" xmlns:w16sdtdh="http://schemas.microsoft.com/office/word/2020/wordml/sdtdatahash" xmlns:w16se="http://schemas.microsoft.com/office/word/2015/wordml/symex" xmlns:wpg="http://schemas.microsoft.com/office/word/2010/wordprocessingGroup" xmlns:wpi="http://schemas.microsoft.com/office/word/2010/wordprocessingInk" xmlns:wne="http://schemas.microsoft.com/office/word/2006/wordml" xmlns:wps="http://schemas.microsoft.com/office/word/2010/wordprocessingShape" mc:Ignorable="w14 w15 w16se w16cid w16 w16cex w16sdtdh wp14">
+<w16cex:commentsExtensible xmlns:wpc="http://schemas.microsoft.com/office/word/2010/wordprocessingCanvas" xmlns:cx="http://schemas.microsoft.com/office/drawing/2014/chartex" xmlns:cx1="http://schemas.microsoft.com/office/drawing/2015/9/8/chartex" xmlns:cx2="http://schemas.microsoft.com/office/drawing/2015/10/21/chartex" xmlns:cx3="http://schemas.microsoft.com/office/drawing/2016/5/9/chartex" xmlns:cx4="http://schemas.microsoft.com/office/drawing/2016/5/10/chartex" xmlns:cx5="http://schemas.microsoft.com/office/drawing/2016/5/11/chartex" xmlns:cx6="http://schemas.microsoft.com/office/drawing/2016/5/12/chartex" xmlns:cx7="http://schemas.microsoft.com/office/drawing/2016/5/13/chartex" xmlns:cx8="http://schemas.microsoft.com/office/drawing/2016/5/14/chartex" xmlns:cr="http://schemas.microsoft.com/office/comments/2020/reactions" xmlns:mc="http://schemas.openxmlformats.org/markup-compatibility/2006" xmlns:aink="http://schemas.microsoft.com/office/drawing/2016/ink" xmlns:am3d="http://schemas.microsoft.com/office/drawing/2017/model3d" xmlns:o="urn:schemas-microsoft-com:office:office" xmlns:oel="http://schemas.microsoft.com/office/2019/extlst" xmlns:r="http://schemas.openxmlformats.org/officeDocument/2006/relationships" xmlns:m="http://schemas.openxmlformats.org/officeDocument/2006/math" xmlns:v="urn:schemas-microsoft-com:vml" xmlns:wp14="http://schemas.microsoft.com/office/word/2010/wordprocessingDrawing" xmlns:wp="http://schemas.openxmlformats.org/drawingml/2006/wordprocessingDrawing" xmlns:w10="urn:schemas-microsoft-com:office:word" xmlns:w="http://schemas.openxmlformats.org/wordprocessingml/2006/main" xmlns:w14="http://schemas.microsoft.com/office/word/2010/wordml" xmlns:w15="http://schemas.microsoft.com/office/word/2012/wordml" xmlns:w16cex="http://schemas.microsoft.com/office/word/2018/wordml/cex" xmlns:w16cid="http://schemas.microsoft.com/office/word/2016/wordml/cid" xmlns:w16="http://schemas.microsoft.com/office/word/2018/wordml" xmlns:w16du="http://schemas.microsoft.com/office/word/2023/wordml/word16du" xmlns:w16sdtdh="http://schemas.microsoft.com/office/word/2020/wordml/sdtdatahash" xmlns:w16sdtfl="http://schemas.microsoft.com/office/word/2024/wordml/sdtformatlock" xmlns:w16se="http://schemas.microsoft.com/office/word/2015/wordml/symex" xmlns:wpg="http://schemas.microsoft.com/office/word/2010/wordprocessingGroup" xmlns:wpi="http://schemas.microsoft.com/office/word/2010/wordprocessingInk" xmlns:wne="http://schemas.microsoft.com/office/word/2006/wordml" xmlns:wps="http://schemas.microsoft.com/office/word/2010/wordprocessingShape" mc:Ignorable="w14 w15 w16se w16cid w16 w16cex w16sdtdh w16sdtfl cr w16du wp14">
   <w16cex:commentExtensible w16cex:durableId="7A89D2ED" w16cex:dateUtc="2026-02-27T16:56:00Z"/>
   <w16cex:commentExtensible w16cex:durableId="2BA46822" w16cex:dateUtc="2026-02-27T17:06:00Z"/>
   <w16cex:commentExtensible w16cex:durableId="5D6BF24F" w16cex:dateUtc="2026-02-27T17:06:00Z"/>
@@ -2433,7 +2497,7 @@
 </file>
 
 <file path=word/commentsIds.xml><?xml version="1.0" encoding="utf-8"?>
-<w16cid:commentsIds xmlns:wpc="http://schemas.microsoft.com/office/word/2010/wordprocessingCanvas" xmlns:cx="http://schemas.microsoft.com/office/drawing/2014/chartex" xmlns:cx1="http://schemas.microsoft.com/office/drawing/2015/9/8/chartex" xmlns:cx2="http://schemas.microsoft.com/office/drawing/2015/10/21/chartex" xmlns:cx3="http://schemas.microsoft.com/office/drawing/2016/5/9/chartex" xmlns:cx4="http://schemas.microsoft.com/office/drawing/2016/5/10/chartex" xmlns:cx5="http://schemas.microsoft.com/office/drawing/2016/5/11/chartex" xmlns:cx6="http://schemas.microsoft.com/office/drawing/2016/5/12/chartex" xmlns:cx7="http://schemas.microsoft.com/office/drawing/2016/5/13/chartex" xmlns:cx8="http://schemas.microsoft.com/office/drawing/2016/5/14/chartex" xmlns:mc="http://schemas.openxmlformats.org/markup-compatibility/2006" xmlns:aink="http://schemas.microsoft.com/office/drawing/2016/ink" xmlns:am3d="http://schemas.microsoft.com/office/drawing/2017/model3d" xmlns:o="urn:schemas-microsoft-com:office:office" xmlns:oel="http://schemas.microsoft.com/office/2019/extlst" xmlns:r="http://schemas.openxmlformats.org/officeDocument/2006/relationships" xmlns:m="http://schemas.openxmlformats.org/officeDocument/2006/math" xmlns:v="urn:schemas-microsoft-com:vml" xmlns:wp14="http://schemas.microsoft.com/office/word/2010/wordprocessingDrawing" xmlns:wp="http://schemas.openxmlformats.org/drawingml/2006/wordprocessingDrawing" xmlns:w10="urn:schemas-microsoft-com:office:word" xmlns:w="http://schemas.openxmlformats.org/wordprocessingml/2006/main" xmlns:w14="http://schemas.microsoft.com/office/word/2010/wordml" xmlns:w15="http://schemas.microsoft.com/office/word/2012/wordml" xmlns:w16cex="http://schemas.microsoft.com/office/word/2018/wordml/cex" xmlns:w16cid="http://schemas.microsoft.com/office/word/2016/wordml/cid" xmlns:w16="http://schemas.microsoft.com/office/word/2018/wordml" xmlns:w16sdtdh="http://schemas.microsoft.com/office/word/2020/wordml/sdtdatahash" xmlns:w16se="http://schemas.microsoft.com/office/word/2015/wordml/symex" xmlns:wpg="http://schemas.microsoft.com/office/word/2010/wordprocessingGroup" xmlns:wpi="http://schemas.microsoft.com/office/word/2010/wordprocessingInk" xmlns:wne="http://schemas.microsoft.com/office/word/2006/wordml" xmlns:wps="http://schemas.microsoft.com/office/word/2010/wordprocessingShape" mc:Ignorable="w14 w15 w16se w16cid w16 w16cex w16sdtdh wp14">
+<w16cid:commentsIds xmlns:wpc="http://schemas.microsoft.com/office/word/2010/wordprocessingCanvas" xmlns:cx="http://schemas.microsoft.com/office/drawing/2014/chartex" xmlns:cx1="http://schemas.microsoft.com/office/drawing/2015/9/8/chartex" xmlns:cx2="http://schemas.microsoft.com/office/drawing/2015/10/21/chartex" xmlns:cx3="http://schemas.microsoft.com/office/drawing/2016/5/9/chartex" xmlns:cx4="http://schemas.microsoft.com/office/drawing/2016/5/10/chartex" xmlns:cx5="http://schemas.microsoft.com/office/drawing/2016/5/11/chartex" xmlns:cx6="http://schemas.microsoft.com/office/drawing/2016/5/12/chartex" xmlns:cx7="http://schemas.microsoft.com/office/drawing/2016/5/13/chartex" xmlns:cx8="http://schemas.microsoft.com/office/drawing/2016/5/14/chartex" xmlns:mc="http://schemas.openxmlformats.org/markup-compatibility/2006" xmlns:aink="http://schemas.microsoft.com/office/drawing/2016/ink" xmlns:am3d="http://schemas.microsoft.com/office/drawing/2017/model3d" xmlns:o="urn:schemas-microsoft-com:office:office" xmlns:oel="http://schemas.microsoft.com/office/2019/extlst" xmlns:r="http://schemas.openxmlformats.org/officeDocument/2006/relationships" xmlns:m="http://schemas.openxmlformats.org/officeDocument/2006/math" xmlns:v="urn:schemas-microsoft-com:vml" xmlns:wp14="http://schemas.microsoft.com/office/word/2010/wordprocessingDrawing" xmlns:wp="http://schemas.openxmlformats.org/drawingml/2006/wordprocessingDrawing" xmlns:w10="urn:schemas-microsoft-com:office:word" xmlns:w="http://schemas.openxmlformats.org/wordprocessingml/2006/main" xmlns:w14="http://schemas.microsoft.com/office/word/2010/wordml" xmlns:w15="http://schemas.microsoft.com/office/word/2012/wordml" xmlns:w16cex="http://schemas.microsoft.com/office/word/2018/wordml/cex" xmlns:w16cid="http://schemas.microsoft.com/office/word/2016/wordml/cid" xmlns:w16="http://schemas.microsoft.com/office/word/2018/wordml" xmlns:w16du="http://schemas.microsoft.com/office/word/2023/wordml/word16du" xmlns:w16sdtdh="http://schemas.microsoft.com/office/word/2020/wordml/sdtdatahash" xmlns:w16sdtfl="http://schemas.microsoft.com/office/word/2024/wordml/sdtformatlock" xmlns:w16se="http://schemas.microsoft.com/office/word/2015/wordml/symex" xmlns:wpg="http://schemas.microsoft.com/office/word/2010/wordprocessingGroup" xmlns:wpi="http://schemas.microsoft.com/office/word/2010/wordprocessingInk" xmlns:wne="http://schemas.microsoft.com/office/word/2006/wordml" xmlns:wps="http://schemas.microsoft.com/office/word/2010/wordprocessingShape" mc:Ignorable="w14 w15 w16se w16cid w16 w16cex w16sdtdh w16sdtfl w16du wp14">
   <w16cid:commentId w16cid:paraId="3817DCA9" w16cid:durableId="7A89D2ED"/>
   <w16cid:commentId w16cid:paraId="69FE89AA" w16cid:durableId="2BA46822"/>
   <w16cid:commentId w16cid:paraId="544ACBE9" w16cid:durableId="5D6BF24F"/>
@@ -2441,7 +2505,7 @@
 </file>
 
 <file path=word/numbering.xml><?xml version="1.0" encoding="utf-8"?>
-<w:numbering xmlns:wpc="http://schemas.microsoft.com/office/word/2010/wordprocessingCanvas" xmlns:cx="http://schemas.microsoft.com/office/drawing/2014/chartex" xmlns:cx1="http://schemas.microsoft.com/office/drawing/2015/9/8/chartex" xmlns:cx2="http://schemas.microsoft.com/office/drawing/2015/10/21/chartex" xmlns:cx3="http://schemas.microsoft.com/office/drawing/2016/5/9/chartex" xmlns:cx4="http://schemas.microsoft.com/office/drawing/2016/5/10/chartex" xmlns:cx5="http://schemas.microsoft.com/office/drawing/2016/5/11/chartex" xmlns:cx6="http://schemas.microsoft.com/office/drawing/2016/5/12/chartex" xmlns:cx7="http://schemas.microsoft.com/office/drawing/2016/5/13/chartex" xmlns:cx8="http://schemas.microsoft.com/office/drawing/2016/5/14/chartex" xmlns:mc="http://schemas.openxmlformats.org/markup-compatibility/2006" xmlns:aink="http://schemas.microsoft.com/office/drawing/2016/ink" xmlns:am3d="http://schemas.microsoft.com/office/drawing/2017/model3d" xmlns:o="urn:schemas-microsoft-com:office:office" xmlns:oel="http://schemas.microsoft.com/office/2019/extlst" xmlns:r="http://schemas.openxmlformats.org/officeDocument/2006/relationships" xmlns:m="http://schemas.openxmlformats.org/officeDocument/2006/math" xmlns:v="urn:schemas-microsoft-com:vml" xmlns:wp14="http://schemas.microsoft.com/office/word/2010/wordprocessingDrawing" xmlns:wp="http://schemas.openxmlformats.org/drawingml/2006/wordprocessingDrawing" xmlns:w10="urn:schemas-microsoft-com:office:word" xmlns:w="http://schemas.openxmlformats.org/wordprocessingml/2006/main" xmlns:w14="http://schemas.microsoft.com/office/word/2010/wordml" xmlns:w15="http://schemas.microsoft.com/office/word/2012/wordml" xmlns:w16cex="http://schemas.microsoft.com/office/word/2018/wordml/cex" xmlns:w16cid="http://schemas.microsoft.com/office/word/2016/wordml/cid" xmlns:w16="http://schemas.microsoft.com/office/word/2018/wordml" xmlns:w16sdtdh="http://schemas.microsoft.com/office/word/2020/wordml/sdtdatahash" xmlns:w16se="http://schemas.microsoft.com/office/word/2015/wordml/symex" xmlns:wpg="http://schemas.microsoft.com/office/word/2010/wordprocessingGroup" xmlns:wpi="http://schemas.microsoft.com/office/word/2010/wordprocessingInk" xmlns:wne="http://schemas.microsoft.com/office/word/2006/wordml" xmlns:wps="http://schemas.microsoft.com/office/word/2010/wordprocessingShape" mc:Ignorable="w14 w15 w16se w16cid w16 w16cex w16sdtdh wp14">
+<w:numbering xmlns:wpc="http://schemas.microsoft.com/office/word/2010/wordprocessingCanvas" xmlns:cx="http://schemas.microsoft.com/office/drawing/2014/chartex" xmlns:cx1="http://schemas.microsoft.com/office/drawing/2015/9/8/chartex" xmlns:cx2="http://schemas.microsoft.com/office/drawing/2015/10/21/chartex" xmlns:cx3="http://schemas.microsoft.com/office/drawing/2016/5/9/chartex" xmlns:cx4="http://schemas.microsoft.com/office/drawing/2016/5/10/chartex" xmlns:cx5="http://schemas.microsoft.com/office/drawing/2016/5/11/chartex" xmlns:cx6="http://schemas.microsoft.com/office/drawing/2016/5/12/chartex" xmlns:cx7="http://schemas.microsoft.com/office/drawing/2016/5/13/chartex" xmlns:cx8="http://schemas.microsoft.com/office/drawing/2016/5/14/chartex" xmlns:mc="http://schemas.openxmlformats.org/markup-compatibility/2006" xmlns:aink="http://schemas.microsoft.com/office/drawing/2016/ink" xmlns:am3d="http://schemas.microsoft.com/office/drawing/2017/model3d" xmlns:o="urn:schemas-microsoft-com:office:office" xmlns:oel="http://schemas.microsoft.com/office/2019/extlst" xmlns:r="http://schemas.openxmlformats.org/officeDocument/2006/relationships" xmlns:m="http://schemas.openxmlformats.org/officeDocument/2006/math" xmlns:v="urn:schemas-microsoft-com:vml" xmlns:wp14="http://schemas.microsoft.com/office/word/2010/wordprocessingDrawing" xmlns:wp="http://schemas.openxmlformats.org/drawingml/2006/wordprocessingDrawing" xmlns:w10="urn:schemas-microsoft-com:office:word" xmlns:w="http://schemas.openxmlformats.org/wordprocessingml/2006/main" xmlns:w14="http://schemas.microsoft.com/office/word/2010/wordml" xmlns:w15="http://schemas.microsoft.com/office/word/2012/wordml" xmlns:w16cex="http://schemas.microsoft.com/office/word/2018/wordml/cex" xmlns:w16cid="http://schemas.microsoft.com/office/word/2016/wordml/cid" xmlns:w16="http://schemas.microsoft.com/office/word/2018/wordml" xmlns:w16du="http://schemas.microsoft.com/office/word/2023/wordml/word16du" xmlns:w16sdtdh="http://schemas.microsoft.com/office/word/2020/wordml/sdtdatahash" xmlns:w16sdtfl="http://schemas.microsoft.com/office/word/2024/wordml/sdtformatlock" xmlns:w16se="http://schemas.microsoft.com/office/word/2015/wordml/symex" xmlns:wpg="http://schemas.microsoft.com/office/word/2010/wordprocessingGroup" xmlns:wpi="http://schemas.microsoft.com/office/word/2010/wordprocessingInk" xmlns:wne="http://schemas.microsoft.com/office/word/2006/wordml" xmlns:wps="http://schemas.microsoft.com/office/word/2010/wordprocessingShape" mc:Ignorable="w14 w15 w16se w16cid w16 w16cex w16sdtdh w16sdtfl w16du wp14">
   <w:abstractNum w:abstractNumId="0" w15:restartNumberingAfterBreak="0">
     <w:nsid w:val="0B1A0DB0"/>
     <w:multiLevelType w:val="hybridMultilevel"/>
@@ -2795,7 +2859,7 @@
 </file>
 
 <file path=word/people.xml><?xml version="1.0" encoding="utf-8"?>
-<w15:people xmlns:wpc="http://schemas.microsoft.com/office/word/2010/wordprocessingCanvas" xmlns:cx="http://schemas.microsoft.com/office/drawing/2014/chartex" xmlns:cx1="http://schemas.microsoft.com/office/drawing/2015/9/8/chartex" xmlns:cx2="http://schemas.microsoft.com/office/drawing/2015/10/21/chartex" xmlns:cx3="http://schemas.microsoft.com/office/drawing/2016/5/9/chartex" xmlns:cx4="http://schemas.microsoft.com/office/drawing/2016/5/10/chartex" xmlns:cx5="http://schemas.microsoft.com/office/drawing/2016/5/11/chartex" xmlns:cx6="http://schemas.microsoft.com/office/drawing/2016/5/12/chartex" xmlns:cx7="http://schemas.microsoft.com/office/drawing/2016/5/13/chartex" xmlns:cx8="http://schemas.microsoft.com/office/drawing/2016/5/14/chartex" xmlns:mc="http://schemas.openxmlformats.org/markup-compatibility/2006" xmlns:aink="http://schemas.microsoft.com/office/drawing/2016/ink" xmlns:am3d="http://schemas.microsoft.com/office/drawing/2017/model3d" xmlns:o="urn:schemas-microsoft-com:office:office" xmlns:oel="http://schemas.microsoft.com/office/2019/extlst" xmlns:r="http://schemas.openxmlformats.org/officeDocument/2006/relationships" xmlns:m="http://schemas.openxmlformats.org/officeDocument/2006/math" xmlns:v="urn:schemas-microsoft-com:vml" xmlns:wp14="http://schemas.microsoft.com/office/word/2010/wordprocessingDrawing" xmlns:wp="http://schemas.openxmlformats.org/drawingml/2006/wordprocessingDrawing" xmlns:w10="urn:schemas-microsoft-com:office:word" xmlns:w="http://schemas.openxmlformats.org/wordprocessingml/2006/main" xmlns:w14="http://schemas.microsoft.com/office/word/2010/wordml" xmlns:w15="http://schemas.microsoft.com/office/word/2012/wordml" xmlns:w16cex="http://schemas.microsoft.com/office/word/2018/wordml/cex" xmlns:w16cid="http://schemas.microsoft.com/office/word/2016/wordml/cid" xmlns:w16="http://schemas.microsoft.com/office/word/2018/wordml" xmlns:w16sdtdh="http://schemas.microsoft.com/office/word/2020/wordml/sdtdatahash" xmlns:w16se="http://schemas.microsoft.com/office/word/2015/wordml/symex" xmlns:wpg="http://schemas.microsoft.com/office/word/2010/wordprocessingGroup" xmlns:wpi="http://schemas.microsoft.com/office/word/2010/wordprocessingInk" xmlns:wne="http://schemas.microsoft.com/office/word/2006/wordml" xmlns:wps="http://schemas.microsoft.com/office/word/2010/wordprocessingShape" mc:Ignorable="w14 w15 w16se w16cid w16 w16cex w16sdtdh wp14">
+<w15:people xmlns:wpc="http://schemas.microsoft.com/office/word/2010/wordprocessingCanvas" xmlns:cx="http://schemas.microsoft.com/office/drawing/2014/chartex" xmlns:cx1="http://schemas.microsoft.com/office/drawing/2015/9/8/chartex" xmlns:cx2="http://schemas.microsoft.com/office/drawing/2015/10/21/chartex" xmlns:cx3="http://schemas.microsoft.com/office/drawing/2016/5/9/chartex" xmlns:cx4="http://schemas.microsoft.com/office/drawing/2016/5/10/chartex" xmlns:cx5="http://schemas.microsoft.com/office/drawing/2016/5/11/chartex" xmlns:cx6="http://schemas.microsoft.com/office/drawing/2016/5/12/chartex" xmlns:cx7="http://schemas.microsoft.com/office/drawing/2016/5/13/chartex" xmlns:cx8="http://schemas.microsoft.com/office/drawing/2016/5/14/chartex" xmlns:mc="http://schemas.openxmlformats.org/markup-compatibility/2006" xmlns:aink="http://schemas.microsoft.com/office/drawing/2016/ink" xmlns:am3d="http://schemas.microsoft.com/office/drawing/2017/model3d" xmlns:o="urn:schemas-microsoft-com:office:office" xmlns:oel="http://schemas.microsoft.com/office/2019/extlst" xmlns:r="http://schemas.openxmlformats.org/officeDocument/2006/relationships" xmlns:m="http://schemas.openxmlformats.org/officeDocument/2006/math" xmlns:v="urn:schemas-microsoft-com:vml" xmlns:wp14="http://schemas.microsoft.com/office/word/2010/wordprocessingDrawing" xmlns:wp="http://schemas.openxmlformats.org/drawingml/2006/wordprocessingDrawing" xmlns:w10="urn:schemas-microsoft-com:office:word" xmlns:w="http://schemas.openxmlformats.org/wordprocessingml/2006/main" xmlns:w14="http://schemas.microsoft.com/office/word/2010/wordml" xmlns:w15="http://schemas.microsoft.com/office/word/2012/wordml" xmlns:w16cex="http://schemas.microsoft.com/office/word/2018/wordml/cex" xmlns:w16cid="http://schemas.microsoft.com/office/word/2016/wordml/cid" xmlns:w16="http://schemas.microsoft.com/office/word/2018/wordml" xmlns:w16du="http://schemas.microsoft.com/office/word/2023/wordml/word16du" xmlns:w16sdtdh="http://schemas.microsoft.com/office/word/2020/wordml/sdtdatahash" xmlns:w16sdtfl="http://schemas.microsoft.com/office/word/2024/wordml/sdtformatlock" xmlns:w16se="http://schemas.microsoft.com/office/word/2015/wordml/symex" xmlns:wpg="http://schemas.microsoft.com/office/word/2010/wordprocessingGroup" xmlns:wpi="http://schemas.microsoft.com/office/word/2010/wordprocessingInk" xmlns:wne="http://schemas.microsoft.com/office/word/2006/wordml" xmlns:wps="http://schemas.microsoft.com/office/word/2010/wordprocessingShape" mc:Ignorable="w14 w15 w16se w16cid w16 w16cex w16sdtdh w16sdtfl w16du wp14">
   <w15:person w15:author="Pamela D Riviere">
     <w15:presenceInfo w15:providerId="AD" w15:userId="S::pdrivier@UCSD.EDU::a5d1394f-fb00-4bb3-8752-1248490c5de1"/>
   </w15:person>
@@ -2803,7 +2867,7 @@
 </file>
 
 <file path=word/styles.xml><?xml version="1.0" encoding="utf-8"?>
-<w:styles xmlns:mc="http://schemas.openxmlformats.org/markup-compatibility/2006" xmlns:r="http://schemas.openxmlformats.org/officeDocument/2006/relationships" xmlns:w="http://schemas.openxmlformats.org/wordprocessingml/2006/main" xmlns:w14="http://schemas.microsoft.com/office/word/2010/wordml" xmlns:w15="http://schemas.microsoft.com/office/word/2012/wordml" xmlns:w16cex="http://schemas.microsoft.com/office/word/2018/wordml/cex" xmlns:w16cid="http://schemas.microsoft.com/office/word/2016/wordml/cid" xmlns:w16="http://schemas.microsoft.com/office/word/2018/wordml" xmlns:w16sdtdh="http://schemas.microsoft.com/office/word/2020/wordml/sdtdatahash" xmlns:w16se="http://schemas.microsoft.com/office/word/2015/wordml/symex" mc:Ignorable="w14 w15 w16se w16cid w16 w16cex w16sdtdh">
+<w:styles xmlns:mc="http://schemas.openxmlformats.org/markup-compatibility/2006" xmlns:r="http://schemas.openxmlformats.org/officeDocument/2006/relationships" xmlns:w="http://schemas.openxmlformats.org/wordprocessingml/2006/main" xmlns:w14="http://schemas.microsoft.com/office/word/2010/wordml" xmlns:w15="http://schemas.microsoft.com/office/word/2012/wordml" xmlns:w16cex="http://schemas.microsoft.com/office/word/2018/wordml/cex" xmlns:w16cid="http://schemas.microsoft.com/office/word/2016/wordml/cid" xmlns:w16="http://schemas.microsoft.com/office/word/2018/wordml" xmlns:w16du="http://schemas.microsoft.com/office/word/2023/wordml/word16du" xmlns:w16sdtdh="http://schemas.microsoft.com/office/word/2020/wordml/sdtdatahash" xmlns:w16sdtfl="http://schemas.microsoft.com/office/word/2024/wordml/sdtformatlock" xmlns:w16se="http://schemas.microsoft.com/office/word/2015/wordml/symex" mc:Ignorable="w14 w15 w16se w16cid w16 w16cex w16sdtdh w16sdtfl w16du">
   <w:docDefaults>
     <w:rPrDefault>
       <w:rPr>
@@ -3857,6 +3921,29 @@
       <w:szCs w:val="20"/>
     </w:rPr>
   </w:style>
+  <w:style w:type="character" w:styleId="Hyperlink">
+    <w:name w:val="Hyperlink"/>
+    <w:basedOn w:val="DefaultParagraphFont"/>
+    <w:uiPriority w:val="99"/>
+    <w:unhideWhenUsed/>
+    <w:rsid w:val="00795074"/>
+    <w:rPr>
+      <w:color w:val="467886" w:themeColor="hyperlink"/>
+      <w:u w:val="single"/>
+    </w:rPr>
+  </w:style>
+  <w:style w:type="character" w:styleId="UnresolvedMention">
+    <w:name w:val="Unresolved Mention"/>
+    <w:basedOn w:val="DefaultParagraphFont"/>
+    <w:uiPriority w:val="99"/>
+    <w:semiHidden/>
+    <w:unhideWhenUsed/>
+    <w:rsid w:val="00795074"/>
+    <w:rPr>
+      <w:color w:val="605E5C"/>
+      <w:shd w:val="clear" w:color="auto" w:fill="E1DFDD"/>
+    </w:rPr>
+  </w:style>
 </w:styles>
 </file>
 

</xml_diff>